<commit_message>
Polish pass: unify figure typography + restrained palette across all 12 figures; enlarge Fig 1 thresholds; refine PV loop
</commit_message>
<xml_diff>
--- a/Final_4D_Flow_CMR_Narrative_Review_FINAL_corrected.docx
+++ b/Final_4D_Flow_CMR_Narrative_Review_FINAL_corrected.docx
@@ -206,8 +206,8 @@
       <w:r>
         <w:drawing>
           <wp:inline xmlns:a="http://schemas.openxmlformats.org/drawingml/2006/main" xmlns:pic="http://schemas.openxmlformats.org/drawingml/2006/picture">
-            <wp:extent cx="5943600" cy="2585619"/>
-            <wp:docPr id="8" name="Picture 8"/>
+            <wp:extent cx="5943600" cy="2604009"/>
+            <wp:docPr id="13" name="Picture 13"/>
             <wp:cNvGraphicFramePr>
               <a:graphicFrameLocks noChangeAspect="1"/>
             </wp:cNvGraphicFramePr>
@@ -219,7 +219,7 @@
                     <pic:cNvPicPr/>
                   </pic:nvPicPr>
                   <pic:blipFill>
-                    <a:blip r:embed="rId16"/>
+                    <a:blip r:embed="rId21"/>
                     <a:stretch>
                       <a:fillRect/>
                     </a:stretch>
@@ -227,7 +227,7 @@
                   <pic:spPr>
                     <a:xfrm>
                       <a:off x="0" y="0"/>
-                      <a:ext cx="5943600" cy="2585619"/>
+                      <a:ext cx="5943600" cy="2604009"/>
                     </a:xfrm>
                     <a:prstGeom prst="rect"/>
                   </pic:spPr>
@@ -848,8 +848,8 @@
       <w:r>
         <w:drawing>
           <wp:inline xmlns:a="http://schemas.openxmlformats.org/drawingml/2006/main" xmlns:pic="http://schemas.openxmlformats.org/drawingml/2006/picture">
-            <wp:extent cx="5943600" cy="1411532"/>
-            <wp:docPr id="1" name="Picture 1"/>
+            <wp:extent cx="5943600" cy="1419946"/>
+            <wp:docPr id="14" name="Picture 14"/>
             <wp:cNvGraphicFramePr>
               <a:graphicFrameLocks noChangeAspect="1"/>
             </wp:cNvGraphicFramePr>
@@ -861,7 +861,7 @@
                     <pic:cNvPicPr/>
                   </pic:nvPicPr>
                   <pic:blipFill>
-                    <a:blip r:embed="rId9"/>
+                    <a:blip r:embed="rId22"/>
                     <a:stretch>
                       <a:fillRect/>
                     </a:stretch>
@@ -869,7 +869,7 @@
                   <pic:spPr>
                     <a:xfrm>
                       <a:off x="0" y="0"/>
-                      <a:ext cx="5943600" cy="1411532"/>
+                      <a:ext cx="5943600" cy="1419946"/>
                     </a:xfrm>
                     <a:prstGeom prst="rect"/>
                   </pic:spPr>
@@ -932,8 +932,8 @@
       <w:r>
         <w:drawing>
           <wp:inline xmlns:a="http://schemas.openxmlformats.org/drawingml/2006/main" xmlns:pic="http://schemas.openxmlformats.org/drawingml/2006/picture">
-            <wp:extent cx="5943600" cy="2530443"/>
-            <wp:docPr id="9" name="Picture 9"/>
+            <wp:extent cx="5943600" cy="2536685"/>
+            <wp:docPr id="15" name="Picture 15"/>
             <wp:cNvGraphicFramePr>
               <a:graphicFrameLocks noChangeAspect="1"/>
             </wp:cNvGraphicFramePr>
@@ -945,7 +945,7 @@
                     <pic:cNvPicPr/>
                   </pic:nvPicPr>
                   <pic:blipFill>
-                    <a:blip r:embed="rId17"/>
+                    <a:blip r:embed="rId23"/>
                     <a:stretch>
                       <a:fillRect/>
                     </a:stretch>
@@ -953,7 +953,7 @@
                   <pic:spPr>
                     <a:xfrm>
                       <a:off x="0" y="0"/>
-                      <a:ext cx="5943600" cy="2530443"/>
+                      <a:ext cx="5943600" cy="2536685"/>
                     </a:xfrm>
                     <a:prstGeom prst="rect"/>
                   </pic:spPr>
@@ -1812,8 +1812,8 @@
       <w:r>
         <w:drawing>
           <wp:inline xmlns:a="http://schemas.openxmlformats.org/drawingml/2006/main" xmlns:pic="http://schemas.openxmlformats.org/drawingml/2006/picture">
-            <wp:extent cx="5486400" cy="2237485"/>
-            <wp:docPr id="10" name="Picture 10"/>
+            <wp:extent cx="5486400" cy="2245894"/>
+            <wp:docPr id="16" name="Picture 16"/>
             <wp:cNvGraphicFramePr>
               <a:graphicFrameLocks noChangeAspect="1"/>
             </wp:cNvGraphicFramePr>
@@ -1825,7 +1825,7 @@
                     <pic:cNvPicPr/>
                   </pic:nvPicPr>
                   <pic:blipFill>
-                    <a:blip r:embed="rId18"/>
+                    <a:blip r:embed="rId24"/>
                     <a:stretch>
                       <a:fillRect/>
                     </a:stretch>
@@ -1833,7 +1833,7 @@
                   <pic:spPr>
                     <a:xfrm>
                       <a:off x="0" y="0"/>
-                      <a:ext cx="5486400" cy="2237485"/>
+                      <a:ext cx="5486400" cy="2245894"/>
                     </a:xfrm>
                     <a:prstGeom prst="rect"/>
                   </pic:spPr>
@@ -2023,8 +2023,8 @@
       <w:r>
         <w:drawing>
           <wp:inline xmlns:a="http://schemas.openxmlformats.org/drawingml/2006/main" xmlns:pic="http://schemas.openxmlformats.org/drawingml/2006/picture">
-            <wp:extent cx="4297680" cy="3306647"/>
-            <wp:docPr id="2" name="Picture 2"/>
+            <wp:extent cx="4297680" cy="3318179"/>
+            <wp:docPr id="17" name="Picture 17"/>
             <wp:cNvGraphicFramePr>
               <a:graphicFrameLocks noChangeAspect="1"/>
             </wp:cNvGraphicFramePr>
@@ -2036,7 +2036,7 @@
                     <pic:cNvPicPr/>
                   </pic:nvPicPr>
                   <pic:blipFill>
-                    <a:blip r:embed="rId10"/>
+                    <a:blip r:embed="rId25"/>
                     <a:stretch>
                       <a:fillRect/>
                     </a:stretch>
@@ -2044,7 +2044,7 @@
                   <pic:spPr>
                     <a:xfrm>
                       <a:off x="0" y="0"/>
-                      <a:ext cx="4297680" cy="3306647"/>
+                      <a:ext cx="4297680" cy="3318179"/>
                     </a:xfrm>
                     <a:prstGeom prst="rect"/>
                   </pic:spPr>
@@ -2161,8 +2161,8 @@
       <w:r>
         <w:drawing>
           <wp:inline xmlns:a="http://schemas.openxmlformats.org/drawingml/2006/main" xmlns:pic="http://schemas.openxmlformats.org/drawingml/2006/picture">
-            <wp:extent cx="5943600" cy="2862755"/>
-            <wp:docPr id="3" name="Picture 3"/>
+            <wp:extent cx="5943600" cy="2864235"/>
+            <wp:docPr id="18" name="Picture 18"/>
             <wp:cNvGraphicFramePr>
               <a:graphicFrameLocks noChangeAspect="1"/>
             </wp:cNvGraphicFramePr>
@@ -2174,7 +2174,7 @@
                     <pic:cNvPicPr/>
                   </pic:nvPicPr>
                   <pic:blipFill>
-                    <a:blip r:embed="rId11"/>
+                    <a:blip r:embed="rId26"/>
                     <a:stretch>
                       <a:fillRect/>
                     </a:stretch>
@@ -2182,7 +2182,7 @@
                   <pic:spPr>
                     <a:xfrm>
                       <a:off x="0" y="0"/>
-                      <a:ext cx="5943600" cy="2862755"/>
+                      <a:ext cx="5943600" cy="2864235"/>
                     </a:xfrm>
                     <a:prstGeom prst="rect"/>
                   </pic:spPr>
@@ -3059,8 +3059,8 @@
       <w:r>
         <w:drawing>
           <wp:inline xmlns:a="http://schemas.openxmlformats.org/drawingml/2006/main" xmlns:pic="http://schemas.openxmlformats.org/drawingml/2006/picture">
-            <wp:extent cx="4480560" cy="3230025"/>
-            <wp:docPr id="4" name="Picture 4"/>
+            <wp:extent cx="4480560" cy="3261997"/>
+            <wp:docPr id="19" name="Picture 19"/>
             <wp:cNvGraphicFramePr>
               <a:graphicFrameLocks noChangeAspect="1"/>
             </wp:cNvGraphicFramePr>
@@ -3072,7 +3072,7 @@
                     <pic:cNvPicPr/>
                   </pic:nvPicPr>
                   <pic:blipFill>
-                    <a:blip r:embed="rId12"/>
+                    <a:blip r:embed="rId27"/>
                     <a:stretch>
                       <a:fillRect/>
                     </a:stretch>
@@ -3080,7 +3080,7 @@
                   <pic:spPr>
                     <a:xfrm>
                       <a:off x="0" y="0"/>
-                      <a:ext cx="4480560" cy="3230025"/>
+                      <a:ext cx="4480560" cy="3261997"/>
                     </a:xfrm>
                     <a:prstGeom prst="rect"/>
                   </pic:spPr>
@@ -3389,8 +3389,8 @@
       <w:r>
         <w:drawing>
           <wp:inline xmlns:a="http://schemas.openxmlformats.org/drawingml/2006/main" xmlns:pic="http://schemas.openxmlformats.org/drawingml/2006/picture">
-            <wp:extent cx="4389120" cy="2982054"/>
-            <wp:docPr id="11" name="Picture 11"/>
+            <wp:extent cx="4389120" cy="2992320"/>
+            <wp:docPr id="20" name="Picture 20"/>
             <wp:cNvGraphicFramePr>
               <a:graphicFrameLocks noChangeAspect="1"/>
             </wp:cNvGraphicFramePr>
@@ -3402,7 +3402,7 @@
                     <pic:cNvPicPr/>
                   </pic:nvPicPr>
                   <pic:blipFill>
-                    <a:blip r:embed="rId19"/>
+                    <a:blip r:embed="rId28"/>
                     <a:stretch>
                       <a:fillRect/>
                     </a:stretch>
@@ -3410,7 +3410,7 @@
                   <pic:spPr>
                     <a:xfrm>
                       <a:off x="0" y="0"/>
-                      <a:ext cx="4389120" cy="2982054"/>
+                      <a:ext cx="4389120" cy="2992320"/>
                     </a:xfrm>
                     <a:prstGeom prst="rect"/>
                   </pic:spPr>
@@ -3561,8 +3561,8 @@
       <w:r>
         <w:drawing>
           <wp:inline xmlns:a="http://schemas.openxmlformats.org/drawingml/2006/main" xmlns:pic="http://schemas.openxmlformats.org/drawingml/2006/picture">
-            <wp:extent cx="4206240" cy="3531539"/>
-            <wp:docPr id="5" name="Picture 5"/>
+            <wp:extent cx="4206240" cy="3540983"/>
+            <wp:docPr id="21" name="Picture 21"/>
             <wp:cNvGraphicFramePr>
               <a:graphicFrameLocks noChangeAspect="1"/>
             </wp:cNvGraphicFramePr>
@@ -3574,7 +3574,7 @@
                     <pic:cNvPicPr/>
                   </pic:nvPicPr>
                   <pic:blipFill>
-                    <a:blip r:embed="rId13"/>
+                    <a:blip r:embed="rId29"/>
                     <a:stretch>
                       <a:fillRect/>
                     </a:stretch>
@@ -3582,7 +3582,7 @@
                   <pic:spPr>
                     <a:xfrm>
                       <a:off x="0" y="0"/>
-                      <a:ext cx="4206240" cy="3531539"/>
+                      <a:ext cx="4206240" cy="3540983"/>
                     </a:xfrm>
                     <a:prstGeom prst="rect"/>
                   </pic:spPr>
@@ -3830,8 +3830,8 @@
       <w:r>
         <w:drawing>
           <wp:inline xmlns:a="http://schemas.openxmlformats.org/drawingml/2006/main" xmlns:pic="http://schemas.openxmlformats.org/drawingml/2006/picture">
-            <wp:extent cx="5943600" cy="2561426"/>
-            <wp:docPr id="6" name="Picture 6"/>
+            <wp:extent cx="5943600" cy="2571274"/>
+            <wp:docPr id="22" name="Picture 22"/>
             <wp:cNvGraphicFramePr>
               <a:graphicFrameLocks noChangeAspect="1"/>
             </wp:cNvGraphicFramePr>
@@ -3843,7 +3843,7 @@
                     <pic:cNvPicPr/>
                   </pic:nvPicPr>
                   <pic:blipFill>
-                    <a:blip r:embed="rId14"/>
+                    <a:blip r:embed="rId30"/>
                     <a:stretch>
                       <a:fillRect/>
                     </a:stretch>
@@ -3851,7 +3851,7 @@
                   <pic:spPr>
                     <a:xfrm>
                       <a:off x="0" y="0"/>
-                      <a:ext cx="5943600" cy="2561426"/>
+                      <a:ext cx="5943600" cy="2571274"/>
                     </a:xfrm>
                     <a:prstGeom prst="rect"/>
                   </pic:spPr>
@@ -4182,8 +4182,8 @@
       <w:r>
         <w:drawing>
           <wp:inline xmlns:a="http://schemas.openxmlformats.org/drawingml/2006/main" xmlns:pic="http://schemas.openxmlformats.org/drawingml/2006/picture">
-            <wp:extent cx="4297680" cy="3004882"/>
-            <wp:docPr id="12" name="Picture 12"/>
+            <wp:extent cx="4297680" cy="3008955"/>
+            <wp:docPr id="23" name="Picture 23"/>
             <wp:cNvGraphicFramePr>
               <a:graphicFrameLocks noChangeAspect="1"/>
             </wp:cNvGraphicFramePr>
@@ -4195,7 +4195,7 @@
                     <pic:cNvPicPr/>
                   </pic:nvPicPr>
                   <pic:blipFill>
-                    <a:blip r:embed="rId20"/>
+                    <a:blip r:embed="rId31"/>
                     <a:stretch>
                       <a:fillRect/>
                     </a:stretch>
@@ -4203,7 +4203,7 @@
                   <pic:spPr>
                     <a:xfrm>
                       <a:off x="0" y="0"/>
-                      <a:ext cx="4297680" cy="3004882"/>
+                      <a:ext cx="4297680" cy="3008955"/>
                     </a:xfrm>
                     <a:prstGeom prst="rect"/>
                   </pic:spPr>
@@ -4394,8 +4394,8 @@
       <w:r>
         <w:drawing>
           <wp:inline xmlns:a="http://schemas.openxmlformats.org/drawingml/2006/main" xmlns:pic="http://schemas.openxmlformats.org/drawingml/2006/picture">
-            <wp:extent cx="5669280" cy="3164376"/>
-            <wp:docPr id="7" name="Picture 7"/>
+            <wp:extent cx="5669280" cy="3170036"/>
+            <wp:docPr id="24" name="Picture 24"/>
             <wp:cNvGraphicFramePr>
               <a:graphicFrameLocks noChangeAspect="1"/>
             </wp:cNvGraphicFramePr>
@@ -4407,7 +4407,7 @@
                     <pic:cNvPicPr/>
                   </pic:nvPicPr>
                   <pic:blipFill>
-                    <a:blip r:embed="rId15"/>
+                    <a:blip r:embed="rId32"/>
                     <a:stretch>
                       <a:fillRect/>
                     </a:stretch>
@@ -4415,7 +4415,7 @@
                   <pic:spPr>
                     <a:xfrm>
                       <a:off x="0" y="0"/>
-                      <a:ext cx="5669280" cy="3164376"/>
+                      <a:ext cx="5669280" cy="3170036"/>
                     </a:xfrm>
                     <a:prstGeom prst="rect"/>
                   </pic:spPr>

</xml_diff>

<commit_message>
Published-figure strategy: replace 5 AI-derived graphs with 3 CC BY published figures (Archer Fig2, Halva Fig3, Grafton-Clarke Fig5); 10 figures + 3 tables
</commit_message>
<xml_diff>
--- a/Final_4D_Flow_CMR_Narrative_Review_FINAL_corrected.docx
+++ b/Final_4D_Flow_CMR_Narrative_Review_FINAL_corrected.docx
@@ -1812,8 +1812,8 @@
       <w:r>
         <w:drawing>
           <wp:inline xmlns:a="http://schemas.openxmlformats.org/drawingml/2006/main" xmlns:pic="http://schemas.openxmlformats.org/drawingml/2006/picture">
-            <wp:extent cx="5486400" cy="2245894"/>
-            <wp:docPr id="16" name="Picture 16"/>
+            <wp:extent cx="3383280" cy="4635717"/>
+            <wp:docPr id="25" name="Picture 25"/>
             <wp:cNvGraphicFramePr>
               <a:graphicFrameLocks noChangeAspect="1"/>
             </wp:cNvGraphicFramePr>
@@ -1821,11 +1821,11 @@
               <a:graphicData uri="http://schemas.openxmlformats.org/drawingml/2006/picture">
                 <pic:pic>
                   <pic:nvPicPr>
-                    <pic:cNvPr id="0" name="figX_vpeak_conflict.png"/>
+                    <pic:cNvPr id="0" name="halva_fig3.jpg"/>
                     <pic:cNvPicPr/>
                   </pic:nvPicPr>
                   <pic:blipFill>
-                    <a:blip r:embed="rId24"/>
+                    <a:blip r:embed="rId33"/>
                     <a:stretch>
                       <a:fillRect/>
                     </a:stretch>
@@ -1833,7 +1833,7 @@
                   <pic:spPr>
                     <a:xfrm>
                       <a:off x="0" y="0"/>
-                      <a:ext cx="5486400" cy="2245894"/>
+                      <a:ext cx="3383280" cy="4635717"/>
                     </a:xfrm>
                     <a:prstGeom prst="rect"/>
                   </pic:spPr>
@@ -1861,37 +1861,7 @@
           <w:i w:val="0"/>
           <w:sz w:val="18"/>
         </w:rPr>
-        <w:t>Directional inconsistency across studies comparing 4D flow and Doppler peak velocity: 4D flow read higher than Doppler in some cohorts and lower in others. Data from Adriaans et al.,</w:t>
-      </w:r>
-      <w:r>
-        <w:rPr>
-          <w:i w:val="0"/>
-          <w:sz w:val="18"/>
-          <w:vertAlign w:val="superscript"/>
-        </w:rPr>
-        <w:t>3</w:t>
-      </w:r>
-      <w:r>
-        <w:rPr>
-          <w:i w:val="0"/>
-          <w:sz w:val="18"/>
-        </w:rPr>
-        <w:t xml:space="preserve"> Grafton-Clarke et al.</w:t>
-      </w:r>
-      <w:r>
-        <w:rPr>
-          <w:i w:val="0"/>
-          <w:sz w:val="18"/>
-          <w:vertAlign w:val="superscript"/>
-        </w:rPr>
-        <w:t>8</w:t>
-      </w:r>
-      <w:r>
-        <w:rPr>
-          <w:i w:val="0"/>
-          <w:sz w:val="18"/>
-        </w:rPr>
-        <w:t xml:space="preserve"> and Hälvä et al.</w:t>
+        <w:t>Comparison of peak systolic velocity measured by transthoracic echocardiography, 2D phase-contrast CMR, angle-corrected 2D phase-contrast CMR and 4D flow CMR in patients with severe aortic stenosis (panel A), and by 4D flow across anatomical positions (panel B). Reproduced from Hälvä et al.</w:t>
       </w:r>
       <w:r>
         <w:rPr>
@@ -1901,6 +1871,13 @@
         </w:rPr>
         <w:t>9</w:t>
       </w:r>
+      <w:r>
+        <w:rPr>
+          <w:i w:val="0"/>
+          <w:sz w:val="18"/>
+        </w:rPr>
+        <w:t xml:space="preserve"> under the Creative Commons Attribution 4.0 International licence.</w:t>
+      </w:r>
     </w:p>
     <w:p>
       <w:pPr>
@@ -1912,7 +1889,7 @@
           <w:i/>
           <w:sz w:val="16"/>
         </w:rPr>
-        <w:t>Vpeak, peak transvalvular velocity. Values are as reported in each study (percentage difference or mean bias); the figure indicates the direction of difference, not a pooled estimate.</w:t>
+        <w:t>2DF, 2D phase-contrast flow; 4DF, 4D flow; AAo, ascending aorta; MIP, maximum-intensity projection; STJ, sinotubular junction; TTE, transthoracic echocardiography.</w:t>
       </w:r>
     </w:p>
     <w:p>
@@ -2023,8 +2000,8 @@
       <w:r>
         <w:drawing>
           <wp:inline xmlns:a="http://schemas.openxmlformats.org/drawingml/2006/main" xmlns:pic="http://schemas.openxmlformats.org/drawingml/2006/picture">
-            <wp:extent cx="4297680" cy="3318179"/>
-            <wp:docPr id="17" name="Picture 17"/>
+            <wp:extent cx="4572000" cy="3554204"/>
+            <wp:docPr id="26" name="Picture 26"/>
             <wp:cNvGraphicFramePr>
               <a:graphicFrameLocks noChangeAspect="1"/>
             </wp:cNvGraphicFramePr>
@@ -2032,11 +2009,11 @@
               <a:graphicData uri="http://schemas.openxmlformats.org/drawingml/2006/picture">
                 <pic:pic>
                   <pic:nvPicPr>
-                    <pic:cNvPr id="0" name="fig4_archer_pg.png"/>
+                    <pic:cNvPr id="0" name="archer_fig2.jpg"/>
                     <pic:cNvPicPr/>
                   </pic:nvPicPr>
                   <pic:blipFill>
-                    <a:blip r:embed="rId25"/>
+                    <a:blip r:embed="rId34"/>
                     <a:stretch>
                       <a:fillRect/>
                     </a:stretch>
@@ -2044,7 +2021,7 @@
                   <pic:spPr>
                     <a:xfrm>
                       <a:off x="0" y="0"/>
-                      <a:ext cx="4297680" cy="3318179"/>
+                      <a:ext cx="4572000" cy="3554204"/>
                     </a:xfrm>
                     <a:prstGeom prst="rect"/>
                   </pic:spPr>
@@ -2069,21 +2046,26 @@
       </w:r>
       <w:r>
         <w:rPr>
-          <w:b w:val="0"/>
           <w:i w:val="0"/>
           <w:sz w:val="18"/>
         </w:rPr>
-        <w:t>Peak transvalvular pressure gradient by modality in the Archer et al. cohort (mean ± SD). Data derived from Archer et al.</w:t>
+        <w:t>Comparison of peak transvalvular pressure gradient measured by invasive catheterisation, Doppler transthoracic echocardiography and 4D flow CMR in the Archer et al. cohort. Reproduced from Archer et al.</w:t>
       </w:r>
       <w:r>
         <w:rPr>
-          <w:b w:val="0"/>
           <w:i w:val="0"/>
           <w:sz w:val="18"/>
           <w:vertAlign w:val="superscript"/>
         </w:rPr>
         <w:t>11</w:t>
       </w:r>
+      <w:r>
+        <w:rPr>
+          <w:i w:val="0"/>
+          <w:sz w:val="18"/>
+        </w:rPr>
+        <w:t xml:space="preserve"> under the Creative Commons Attribution 4.0 International licence.</w:t>
+      </w:r>
     </w:p>
     <w:p>
       <w:pPr>
@@ -2092,11 +2074,10 @@
       </w:pPr>
       <w:r>
         <w:rPr>
-          <w:b w:val="0"/>
           <w:i/>
           <w:sz w:val="16"/>
         </w:rPr>
-        <w:t>SD, standard deviation; TTE, transthoracic echocardiography. Values reflect the subgroup undergoing invasive assessment within a small single-centre cohort; the figure illustrates between-modality differences and should not be interpreted as evidence of superiority or of equivalent precision.</w:t>
+        <w:t>TTE, transthoracic echocardiography. *statistically significant difference.</w:t>
       </w:r>
     </w:p>
     <w:p>
@@ -3053,90 +3034,6 @@
     </w:p>
     <w:p>
       <w:pPr>
-        <w:spacing w:before="160" w:after="40"/>
-        <w:jc w:val="center"/>
-      </w:pPr>
-      <w:r>
-        <w:drawing>
-          <wp:inline xmlns:a="http://schemas.openxmlformats.org/drawingml/2006/main" xmlns:pic="http://schemas.openxmlformats.org/drawingml/2006/picture">
-            <wp:extent cx="4480560" cy="3261997"/>
-            <wp:docPr id="19" name="Picture 19"/>
-            <wp:cNvGraphicFramePr>
-              <a:graphicFrameLocks noChangeAspect="1"/>
-            </wp:cNvGraphicFramePr>
-            <a:graphic>
-              <a:graphicData uri="http://schemas.openxmlformats.org/drawingml/2006/picture">
-                <pic:pic>
-                  <pic:nvPicPr>
-                    <pic:cNvPr id="0" name="fig6_aliabadi_vel.png"/>
-                    <pic:cNvPicPr/>
-                  </pic:nvPicPr>
-                  <pic:blipFill>
-                    <a:blip r:embed="rId27"/>
-                    <a:stretch>
-                      <a:fillRect/>
-                    </a:stretch>
-                  </pic:blipFill>
-                  <pic:spPr>
-                    <a:xfrm>
-                      <a:off x="0" y="0"/>
-                      <a:ext cx="4480560" cy="3261997"/>
-                    </a:xfrm>
-                    <a:prstGeom prst="rect"/>
-                  </pic:spPr>
-                </pic:pic>
-              </a:graphicData>
-            </a:graphic>
-          </wp:inline>
-        </w:drawing>
-      </w:r>
-    </w:p>
-    <w:p>
-      <w:pPr>
-        <w:spacing w:after="20"/>
-        <w:jc w:val="both"/>
-      </w:pPr>
-      <w:r>
-        <w:rPr>
-          <w:b/>
-          <w:sz w:val="18"/>
-        </w:rPr>
-        <w:t xml:space="preserve">Figure 7. </w:t>
-      </w:r>
-      <w:r>
-        <w:rPr>
-          <w:b w:val="0"/>
-          <w:i w:val="0"/>
-          <w:sz w:val="18"/>
-        </w:rPr>
-        <w:t>Peak-systolic viscous energy loss across control and bicuspid-aortic-valve groups (median; whiskers denote the interquartile range). Data derived from Aliabadi et al.</w:t>
-      </w:r>
-      <w:r>
-        <w:rPr>
-          <w:b w:val="0"/>
-          <w:i w:val="0"/>
-          <w:sz w:val="18"/>
-          <w:vertAlign w:val="superscript"/>
-        </w:rPr>
-        <w:t>14</w:t>
-      </w:r>
-    </w:p>
-    <w:p>
-      <w:pPr>
-        <w:spacing w:after="160"/>
-        <w:jc w:val="both"/>
-      </w:pPr>
-      <w:r>
-        <w:rPr>
-          <w:b w:val="0"/>
-          <w:i/>
-          <w:sz w:val="16"/>
-        </w:rPr>
-        <w:t>BAV, bicuspid aortic valve; TAV, tricuspid aortic valve; VEL, viscous energy loss. Values are median [IQR]. The uncomplicated BAV group did not differ significantly from controls for peak-systolic VEL. The cohort was predominantly BAV and should not be interpreted as representative of degenerative tricuspid aortic stenosis.</w:t>
-      </w:r>
-    </w:p>
-    <w:p>
-      <w:pPr>
         <w:spacing w:line="360" w:lineRule="auto" w:after="120"/>
         <w:jc w:val="both"/>
       </w:pPr>
@@ -3379,87 +3276,6 @@
       </w:r>
       <w:r>
         <w:t xml:space="preserve"> These findings suggest that relieving the valvular obstruction changes the distribution and timing of intracavitary blood-flow energy.</w:t>
-      </w:r>
-    </w:p>
-    <w:p>
-      <w:pPr>
-        <w:spacing w:before="160" w:after="40"/>
-        <w:jc w:val="center"/>
-      </w:pPr>
-      <w:r>
-        <w:drawing>
-          <wp:inline xmlns:a="http://schemas.openxmlformats.org/drawingml/2006/main" xmlns:pic="http://schemas.openxmlformats.org/drawingml/2006/picture">
-            <wp:extent cx="4389120" cy="2992320"/>
-            <wp:docPr id="20" name="Picture 20"/>
-            <wp:cNvGraphicFramePr>
-              <a:graphicFrameLocks noChangeAspect="1"/>
-            </wp:cNvGraphicFramePr>
-            <a:graphic>
-              <a:graphicData uri="http://schemas.openxmlformats.org/drawingml/2006/picture">
-                <pic:pic>
-                  <pic:nvPicPr>
-                    <pic:cNvPr id="0" name="figY_elhawaz_ke.png"/>
-                    <pic:cNvPicPr/>
-                  </pic:nvPicPr>
-                  <pic:blipFill>
-                    <a:blip r:embed="rId28"/>
-                    <a:stretch>
-                      <a:fillRect/>
-                    </a:stretch>
-                  </pic:blipFill>
-                  <pic:spPr>
-                    <a:xfrm>
-                      <a:off x="0" y="0"/>
-                      <a:ext cx="4389120" cy="2992320"/>
-                    </a:xfrm>
-                    <a:prstGeom prst="rect"/>
-                  </pic:spPr>
-                </pic:pic>
-              </a:graphicData>
-            </a:graphic>
-          </wp:inline>
-        </w:drawing>
-      </w:r>
-    </w:p>
-    <w:p>
-      <w:pPr>
-        <w:spacing w:after="20"/>
-        <w:jc w:val="both"/>
-      </w:pPr>
-      <w:r>
-        <w:rPr>
-          <w:b/>
-          <w:sz w:val="18"/>
-        </w:rPr>
-        <w:t xml:space="preserve">Figure 8. </w:t>
-      </w:r>
-      <w:r>
-        <w:rPr>
-          <w:i w:val="0"/>
-          <w:sz w:val="18"/>
-        </w:rPr>
-        <w:t>Left ventricular blood-flow kinetic-energy components before and after valve intervention (median values). Only the direct and delayed components changed significantly. Data derived from Elhawaz et al.</w:t>
-      </w:r>
-      <w:r>
-        <w:rPr>
-          <w:i w:val="0"/>
-          <w:sz w:val="18"/>
-          <w:vertAlign w:val="superscript"/>
-        </w:rPr>
-        <w:t>17</w:t>
-      </w:r>
-    </w:p>
-    <w:p>
-      <w:pPr>
-        <w:spacing w:after="160"/>
-        <w:jc w:val="both"/>
-      </w:pPr>
-      <w:r>
-        <w:rPr>
-          <w:i/>
-          <w:sz w:val="16"/>
-        </w:rPr>
-        <w:t>LV, left ventricle; ns, not significant; μJ, microjoules. Values are medians; no error bars are shown because the data were reported as median [IQR]. *P &lt; 0.05.</w:t>
       </w:r>
     </w:p>
     <w:p>
@@ -3603,7 +3419,7 @@
           <w:b/>
           <w:sz w:val="18"/>
         </w:rPr>
-        <w:t xml:space="preserve">Figure 9. </w:t>
+        <w:t xml:space="preserve">Figure 7. </w:t>
       </w:r>
       <w:r>
         <w:rPr>
@@ -3872,7 +3688,7 @@
           <w:b/>
           <w:sz w:val="18"/>
         </w:rPr>
-        <w:t xml:space="preserve">Figure 10. </w:t>
+        <w:t xml:space="preserve">Figure 8. </w:t>
       </w:r>
       <w:r>
         <w:rPr>
@@ -4182,8 +3998,8 @@
       <w:r>
         <w:drawing>
           <wp:inline xmlns:a="http://schemas.openxmlformats.org/drawingml/2006/main" xmlns:pic="http://schemas.openxmlformats.org/drawingml/2006/picture">
-            <wp:extent cx="4297680" cy="3008955"/>
-            <wp:docPr id="23" name="Picture 23"/>
+            <wp:extent cx="4754880" cy="4108385"/>
+            <wp:docPr id="27" name="Picture 27"/>
             <wp:cNvGraphicFramePr>
               <a:graphicFrameLocks noChangeAspect="1"/>
             </wp:cNvGraphicFramePr>
@@ -4191,11 +4007,11 @@
               <a:graphicData uri="http://schemas.openxmlformats.org/drawingml/2006/picture">
                 <pic:pic>
                   <pic:nvPicPr>
-                    <pic:cNvPr id="0" name="figZ_gc_vpeak.png"/>
+                    <pic:cNvPr id="0" name="gc2025_fig5.jpg"/>
                     <pic:cNvPicPr/>
                   </pic:nvPicPr>
                   <pic:blipFill>
-                    <a:blip r:embed="rId31"/>
+                    <a:blip r:embed="rId35"/>
                     <a:stretch>
                       <a:fillRect/>
                     </a:stretch>
@@ -4203,7 +4019,7 @@
                   <pic:spPr>
                     <a:xfrm>
                       <a:off x="0" y="0"/>
-                      <a:ext cx="4297680" cy="3008955"/>
+                      <a:ext cx="4754880" cy="4108385"/>
                     </a:xfrm>
                     <a:prstGeom prst="rect"/>
                   </pic:spPr>
@@ -4224,14 +4040,14 @@
           <w:b/>
           <w:sz w:val="18"/>
         </w:rPr>
-        <w:t xml:space="preserve">Figure 11. </w:t>
+        <w:t xml:space="preserve">Figure 9. </w:t>
       </w:r>
       <w:r>
         <w:rPr>
           <w:i w:val="0"/>
           <w:sz w:val="18"/>
         </w:rPr>
-        <w:t>Peak velocity by subsequent-intervention status, measured by continuous-wave Doppler and 4D flow CMR. Data derived from Grafton-Clarke et al.</w:t>
+        <w:t>Cox regression analysis for aortic-valve intervention. 4D flow CMR peak velocity was associated with subsequent intervention (hazard ratio 2.51), whereas continuous-wave Doppler peak and mean velocities were not. Reproduced from Grafton-Clarke et al.</w:t>
       </w:r>
       <w:r>
         <w:rPr>
@@ -4241,6 +4057,13 @@
         </w:rPr>
         <w:t>8</w:t>
       </w:r>
+      <w:r>
+        <w:rPr>
+          <w:i w:val="0"/>
+          <w:sz w:val="18"/>
+        </w:rPr>
+        <w:t xml:space="preserve"> under the Creative Commons Attribution 4.0 International licence.</w:t>
+      </w:r>
     </w:p>
     <w:p>
       <w:pPr>
@@ -4252,7 +4075,7 @@
           <w:i/>
           <w:sz w:val="16"/>
         </w:rPr>
-        <w:t>CWD, continuous-wave Doppler. The outcome was the decision to undertake valve intervention rather than a hard patient-centred endpoint; the 3.5 m/s value is an exploratory threshold derived from a small cohort, not an established clinical criterion.</w:t>
+        <w:t>AV, aortic valve; CWD, continuous-wave Doppler; HR, hazard ratio; V_peak, peak velocity.</w:t>
       </w:r>
     </w:p>
     <w:p>
@@ -4436,7 +4259,7 @@
           <w:b/>
           <w:sz w:val="18"/>
         </w:rPr>
-        <w:t xml:space="preserve">Figure 12. </w:t>
+        <w:t xml:space="preserve">Figure 10. </w:t>
       </w:r>
       <w:r>
         <w:rPr>

</xml_diff>

<commit_message>
Replace Figure 7 with published LV pressure-volume loop (Arvidsson et al. 2023, Fig 1, CC BY 4.0)
</commit_message>
<xml_diff>
--- a/Final_4D_Flow_CMR_Narrative_Review_FINAL_corrected.docx
+++ b/Final_4D_Flow_CMR_Narrative_Review_FINAL_corrected.docx
@@ -3377,8 +3377,8 @@
       <w:r>
         <w:drawing>
           <wp:inline xmlns:a="http://schemas.openxmlformats.org/drawingml/2006/main" xmlns:pic="http://schemas.openxmlformats.org/drawingml/2006/picture">
-            <wp:extent cx="4206240" cy="3540983"/>
-            <wp:docPr id="21" name="Picture 21"/>
+            <wp:extent cx="4846320" cy="2901415"/>
+            <wp:docPr id="28" name="Picture 28"/>
             <wp:cNvGraphicFramePr>
               <a:graphicFrameLocks noChangeAspect="1"/>
             </wp:cNvGraphicFramePr>
@@ -3386,11 +3386,11 @@
               <a:graphicData uri="http://schemas.openxmlformats.org/drawingml/2006/picture">
                 <pic:pic>
                   <pic:nvPicPr>
-                    <pic:cNvPr id="0" name="fig7_pvloop.png"/>
+                    <pic:cNvPr id="0" name="arvidsson_fig1_pvloop.jpg"/>
                     <pic:cNvPicPr/>
                   </pic:nvPicPr>
                   <pic:blipFill>
-                    <a:blip r:embed="rId29"/>
+                    <a:blip r:embed="rId36"/>
                     <a:stretch>
                       <a:fillRect/>
                     </a:stretch>
@@ -3398,7 +3398,7 @@
                   <pic:spPr>
                     <a:xfrm>
                       <a:off x="0" y="0"/>
-                      <a:ext cx="4206240" cy="3540983"/>
+                      <a:ext cx="4846320" cy="2901415"/>
                     </a:xfrm>
                     <a:prstGeom prst="rect"/>
                   </pic:spPr>
@@ -3427,7 +3427,24 @@
           <w:i w:val="0"/>
           <w:sz w:val="18"/>
         </w:rPr>
-        <w:t>Schematic left ventricular pressure–volume loop. The enclosed area represents stroke work; the pressure–volume area (PVA) additionally incorporates potential energy. Original schematic.</w:t>
+        <w:t>Left ventricular pressure–volume loop. The area enclosed by the loop is the stroke work (SW); the area bounded by the end-systolic pressure–volume relationship (ESPVR) and the end-systolic volume is the potential energy (PE); together these constitute the pressure–volume area. Reproduced from Arvidsson et al.</w:t>
+      </w:r>
+      <w:r>
+        <w:rPr>
+          <w:b w:val="0"/>
+          <w:i w:val="0"/>
+          <w:sz w:val="18"/>
+          <w:vertAlign w:val="superscript"/>
+        </w:rPr>
+        <w:t>20</w:t>
+      </w:r>
+      <w:r>
+        <w:rPr>
+          <w:b w:val="0"/>
+          <w:i w:val="0"/>
+          <w:sz w:val="18"/>
+        </w:rPr>
+        <w:t xml:space="preserve"> under the Creative Commons Attribution 4.0 International licence.</w:t>
       </w:r>
     </w:p>
     <w:p>
@@ -3441,7 +3458,7 @@
           <w:i/>
           <w:sz w:val="16"/>
         </w:rPr>
-        <w:t>EDPVR, end-diastolic pressure–volume relationship; ESPVR, end-systolic pressure–volume relationship; LV, left ventricle; PVA, pressure–volume area. Diagram is illustrative and not drawn to scale.</w:t>
+        <w:t>Ea, arterial elastance; EDV, end-diastolic volume; Emax, point of maximal elastance; ESPVR, end-systolic pressure–volume relationship; ESV, end-systolic volume; LV, left ventricle; PE, potential energy; SW, stroke work; V0, volume-axis intercept. MEP (mean external power), VE (ventricular efficiency) and EPEV are further energetic parameters derived from the loop, as defined in the source.</w:t>
       </w:r>
     </w:p>
     <w:p>

</xml_diff>

<commit_message>
Refine Figure 7 caption wording and Emax definition (maximal elastance); add PVA to caption/footnote
</commit_message>
<xml_diff>
--- a/Final_4D_Flow_CMR_Narrative_Review_FINAL_corrected.docx
+++ b/Final_4D_Flow_CMR_Narrative_Review_FINAL_corrected.docx
@@ -3423,15 +3423,13 @@
       </w:r>
       <w:r>
         <w:rPr>
-          <w:b w:val="0"/>
           <w:i w:val="0"/>
           <w:sz w:val="18"/>
         </w:rPr>
-        <w:t>Left ventricular pressure–volume loop. The area enclosed by the loop is the stroke work (SW); the area bounded by the end-systolic pressure–volume relationship (ESPVR) and the end-systolic volume is the potential energy (PE); together these constitute the pressure–volume area. Reproduced from Arvidsson et al.</w:t>
+        <w:t>Left ventricular pressure–volume loop. The area enclosed by the loop represents stroke work (SW), while the area between the end-systolic pressure–volume relationship (ESPVR) and the end-systolic volume represents potential energy (PE); together, these constitute the pressure–volume area (PVA). Reproduced from Arvidsson et al.</w:t>
       </w:r>
       <w:r>
         <w:rPr>
-          <w:b w:val="0"/>
           <w:i w:val="0"/>
           <w:sz w:val="18"/>
           <w:vertAlign w:val="superscript"/>
@@ -3440,7 +3438,6 @@
       </w:r>
       <w:r>
         <w:rPr>
-          <w:b w:val="0"/>
           <w:i w:val="0"/>
           <w:sz w:val="18"/>
         </w:rPr>
@@ -3454,11 +3451,10 @@
       </w:pPr>
       <w:r>
         <w:rPr>
-          <w:b w:val="0"/>
           <w:i/>
           <w:sz w:val="16"/>
         </w:rPr>
-        <w:t>Ea, arterial elastance; EDV, end-diastolic volume; Emax, point of maximal elastance; ESPVR, end-systolic pressure–volume relationship; ESV, end-systolic volume; LV, left ventricle; PE, potential energy; SW, stroke work; V0, volume-axis intercept. MEP (mean external power), VE (ventricular efficiency) and EPEV are further energetic parameters derived from the loop, as defined in the source.</w:t>
+        <w:t>Ea, arterial elastance; EDV, end-diastolic volume; Emax, maximal elastance; ESPVR, end-systolic pressure–volume relationship; ESV, end-systolic volume; LV, left ventricle; PE, potential energy; PVA, pressure–volume area; SW, stroke work; V0, volume-axis intercept. MEP (mean external power), VE (ventricular efficiency) and EPEV are further energetic parameters derived from the loop, as defined in the source.</w:t>
       </w:r>
     </w:p>
     <w:p>

</xml_diff>

<commit_message>
Add clean alphabetised Abbreviations section (28 used terms, hanging indent); drop unused KE/LGE/LVEDV/MPG
</commit_message>
<xml_diff>
--- a/Final_4D_Flow_CMR_Narrative_Review_FINAL_corrected.docx
+++ b/Final_4D_Flow_CMR_Narrative_Review_FINAL_corrected.docx
@@ -13,6 +13,667 @@
           <w:sz w:val="32"/>
         </w:rPr>
         <w:t>Beyond the Gradient: A Narrative Review of 4D Flow CMR in Aortic Stenosis</w:t>
+      </w:r>
+    </w:p>
+    <w:p>
+      <w:pPr>
+        <w:spacing w:before="200" w:after="120"/>
+      </w:pPr>
+      <w:r>
+        <w:rPr>
+          <w:b/>
+          <w:sz w:val="28"/>
+        </w:rPr>
+        <w:t>Abbreviations</w:t>
+      </w:r>
+    </w:p>
+    <w:p>
+      <w:pPr>
+        <w:tabs>
+          <w:tab w:pos="2088" w:val="left"/>
+        </w:tabs>
+        <w:spacing w:after="40"/>
+        <w:ind w:left="2088" w:hanging="2088"/>
+      </w:pPr>
+      <w:r>
+        <w:rPr>
+          <w:b/>
+          <w:sz w:val="22"/>
+        </w:rPr>
+        <w:t>4D flow CMR</w:t>
+      </w:r>
+      <w:r>
+        <w:rPr>
+          <w:sz w:val="22"/>
+        </w:rPr>
+        <w:tab/>
+        <w:t>Four-dimensional flow cardiovascular magnetic resonance</w:t>
+      </w:r>
+    </w:p>
+    <w:p>
+      <w:pPr>
+        <w:tabs>
+          <w:tab w:pos="2088" w:val="left"/>
+        </w:tabs>
+        <w:spacing w:after="40"/>
+        <w:ind w:left="2088" w:hanging="2088"/>
+      </w:pPr>
+      <w:r>
+        <w:rPr>
+          <w:b/>
+          <w:sz w:val="22"/>
+        </w:rPr>
+        <w:t>6MWT</w:t>
+      </w:r>
+      <w:r>
+        <w:rPr>
+          <w:sz w:val="22"/>
+        </w:rPr>
+        <w:tab/>
+        <w:t>Six-minute walk test</w:t>
+      </w:r>
+    </w:p>
+    <w:p>
+      <w:pPr>
+        <w:tabs>
+          <w:tab w:pos="2088" w:val="left"/>
+        </w:tabs>
+        <w:spacing w:after="40"/>
+        <w:ind w:left="2088" w:hanging="2088"/>
+      </w:pPr>
+      <w:r>
+        <w:rPr>
+          <w:b/>
+          <w:sz w:val="22"/>
+        </w:rPr>
+        <w:t>AS</w:t>
+      </w:r>
+      <w:r>
+        <w:rPr>
+          <w:sz w:val="22"/>
+        </w:rPr>
+        <w:tab/>
+        <w:t>Aortic stenosis</w:t>
+      </w:r>
+    </w:p>
+    <w:p>
+      <w:pPr>
+        <w:tabs>
+          <w:tab w:pos="2088" w:val="left"/>
+        </w:tabs>
+        <w:spacing w:after="40"/>
+        <w:ind w:left="2088" w:hanging="2088"/>
+      </w:pPr>
+      <w:r>
+        <w:rPr>
+          <w:b/>
+          <w:sz w:val="22"/>
+        </w:rPr>
+        <w:t>AVA</w:t>
+      </w:r>
+      <w:r>
+        <w:rPr>
+          <w:sz w:val="22"/>
+        </w:rPr>
+        <w:tab/>
+        <w:t>Aortic valve area</w:t>
+      </w:r>
+    </w:p>
+    <w:p>
+      <w:pPr>
+        <w:tabs>
+          <w:tab w:pos="2088" w:val="left"/>
+        </w:tabs>
+        <w:spacing w:after="40"/>
+        <w:ind w:left="2088" w:hanging="2088"/>
+      </w:pPr>
+      <w:r>
+        <w:rPr>
+          <w:b/>
+          <w:sz w:val="22"/>
+        </w:rPr>
+        <w:t>BAV</w:t>
+      </w:r>
+      <w:r>
+        <w:rPr>
+          <w:sz w:val="22"/>
+        </w:rPr>
+        <w:tab/>
+        <w:t>Bicuspid aortic valve</w:t>
+      </w:r>
+    </w:p>
+    <w:p>
+      <w:pPr>
+        <w:tabs>
+          <w:tab w:pos="2088" w:val="left"/>
+        </w:tabs>
+        <w:spacing w:after="40"/>
+        <w:ind w:left="2088" w:hanging="2088"/>
+      </w:pPr>
+      <w:r>
+        <w:rPr>
+          <w:b/>
+          <w:sz w:val="22"/>
+        </w:rPr>
+        <w:t>CMR</w:t>
+      </w:r>
+      <w:r>
+        <w:rPr>
+          <w:sz w:val="22"/>
+        </w:rPr>
+        <w:tab/>
+        <w:t>Cardiovascular magnetic resonance</w:t>
+      </w:r>
+    </w:p>
+    <w:p>
+      <w:pPr>
+        <w:tabs>
+          <w:tab w:pos="2088" w:val="left"/>
+        </w:tabs>
+        <w:spacing w:after="40"/>
+        <w:ind w:left="2088" w:hanging="2088"/>
+      </w:pPr>
+      <w:r>
+        <w:rPr>
+          <w:b/>
+          <w:sz w:val="22"/>
+        </w:rPr>
+        <w:t>CWD</w:t>
+      </w:r>
+      <w:r>
+        <w:rPr>
+          <w:sz w:val="22"/>
+        </w:rPr>
+        <w:tab/>
+        <w:t>Continuous-wave Doppler</w:t>
+      </w:r>
+    </w:p>
+    <w:p>
+      <w:pPr>
+        <w:tabs>
+          <w:tab w:pos="2088" w:val="left"/>
+        </w:tabs>
+        <w:spacing w:after="40"/>
+        <w:ind w:left="2088" w:hanging="2088"/>
+      </w:pPr>
+      <w:r>
+        <w:rPr>
+          <w:b/>
+          <w:sz w:val="22"/>
+        </w:rPr>
+        <w:t>EACTS</w:t>
+      </w:r>
+      <w:r>
+        <w:rPr>
+          <w:sz w:val="22"/>
+        </w:rPr>
+        <w:tab/>
+        <w:t>European Association for Cardio-Thoracic Surgery</w:t>
+      </w:r>
+    </w:p>
+    <w:p>
+      <w:pPr>
+        <w:tabs>
+          <w:tab w:pos="2088" w:val="left"/>
+        </w:tabs>
+        <w:spacing w:after="40"/>
+        <w:ind w:left="2088" w:hanging="2088"/>
+      </w:pPr>
+      <w:r>
+        <w:rPr>
+          <w:b/>
+          <w:sz w:val="22"/>
+        </w:rPr>
+        <w:t>ECG</w:t>
+      </w:r>
+      <w:r>
+        <w:rPr>
+          <w:sz w:val="22"/>
+        </w:rPr>
+        <w:tab/>
+        <w:t>Electrocardiogram</w:t>
+      </w:r>
+    </w:p>
+    <w:p>
+      <w:pPr>
+        <w:tabs>
+          <w:tab w:pos="2088" w:val="left"/>
+        </w:tabs>
+        <w:spacing w:after="40"/>
+        <w:ind w:left="2088" w:hanging="2088"/>
+      </w:pPr>
+      <w:r>
+        <w:rPr>
+          <w:b/>
+          <w:sz w:val="22"/>
+        </w:rPr>
+        <w:t>EOA</w:t>
+      </w:r>
+      <w:r>
+        <w:rPr>
+          <w:sz w:val="22"/>
+        </w:rPr>
+        <w:tab/>
+        <w:t>Effective orifice area</w:t>
+      </w:r>
+    </w:p>
+    <w:p>
+      <w:pPr>
+        <w:tabs>
+          <w:tab w:pos="2088" w:val="left"/>
+        </w:tabs>
+        <w:spacing w:after="40"/>
+        <w:ind w:left="2088" w:hanging="2088"/>
+      </w:pPr>
+      <w:r>
+        <w:rPr>
+          <w:b/>
+          <w:sz w:val="22"/>
+        </w:rPr>
+        <w:t>ESC</w:t>
+      </w:r>
+      <w:r>
+        <w:rPr>
+          <w:sz w:val="22"/>
+        </w:rPr>
+        <w:tab/>
+        <w:t>European Society of Cardiology</w:t>
+      </w:r>
+    </w:p>
+    <w:p>
+      <w:pPr>
+        <w:tabs>
+          <w:tab w:pos="2088" w:val="left"/>
+        </w:tabs>
+        <w:spacing w:after="40"/>
+        <w:ind w:left="2088" w:hanging="2088"/>
+      </w:pPr>
+      <w:r>
+        <w:rPr>
+          <w:b/>
+          <w:sz w:val="22"/>
+        </w:rPr>
+        <w:t>KEiEDV</w:t>
+      </w:r>
+      <w:r>
+        <w:rPr>
+          <w:sz w:val="22"/>
+        </w:rPr>
+        <w:tab/>
+        <w:t>Kinetic energy indexed to end-diastolic volume</w:t>
+      </w:r>
+    </w:p>
+    <w:p>
+      <w:pPr>
+        <w:tabs>
+          <w:tab w:pos="2088" w:val="left"/>
+        </w:tabs>
+        <w:spacing w:after="40"/>
+        <w:ind w:left="2088" w:hanging="2088"/>
+      </w:pPr>
+      <w:r>
+        <w:rPr>
+          <w:b/>
+          <w:sz w:val="22"/>
+        </w:rPr>
+        <w:t>LV</w:t>
+      </w:r>
+      <w:r>
+        <w:rPr>
+          <w:sz w:val="22"/>
+        </w:rPr>
+        <w:tab/>
+        <w:t>Left ventricle / left ventricular</w:t>
+      </w:r>
+    </w:p>
+    <w:p>
+      <w:pPr>
+        <w:tabs>
+          <w:tab w:pos="2088" w:val="left"/>
+        </w:tabs>
+        <w:spacing w:after="40"/>
+        <w:ind w:left="2088" w:hanging="2088"/>
+      </w:pPr>
+      <w:r>
+        <w:rPr>
+          <w:b/>
+          <w:sz w:val="22"/>
+        </w:rPr>
+        <w:t>LVOT</w:t>
+      </w:r>
+      <w:r>
+        <w:rPr>
+          <w:sz w:val="22"/>
+        </w:rPr>
+        <w:tab/>
+        <w:t>Left ventricular outflow tract</w:t>
+      </w:r>
+    </w:p>
+    <w:p>
+      <w:pPr>
+        <w:tabs>
+          <w:tab w:pos="2088" w:val="left"/>
+        </w:tabs>
+        <w:spacing w:after="40"/>
+        <w:ind w:left="2088" w:hanging="2088"/>
+      </w:pPr>
+      <w:r>
+        <w:rPr>
+          <w:b/>
+          <w:sz w:val="22"/>
+        </w:rPr>
+        <w:t>NYHA</w:t>
+      </w:r>
+      <w:r>
+        <w:rPr>
+          <w:sz w:val="22"/>
+        </w:rPr>
+        <w:tab/>
+        <w:t>New York Heart Association</w:t>
+      </w:r>
+    </w:p>
+    <w:p>
+      <w:pPr>
+        <w:tabs>
+          <w:tab w:pos="2088" w:val="left"/>
+        </w:tabs>
+        <w:spacing w:after="40"/>
+        <w:ind w:left="2088" w:hanging="2088"/>
+      </w:pPr>
+      <w:r>
+        <w:rPr>
+          <w:b/>
+          <w:sz w:val="22"/>
+        </w:rPr>
+        <w:t>PE</w:t>
+      </w:r>
+      <w:r>
+        <w:rPr>
+          <w:sz w:val="22"/>
+        </w:rPr>
+        <w:tab/>
+        <w:t>Potential energy</w:t>
+      </w:r>
+    </w:p>
+    <w:p>
+      <w:pPr>
+        <w:tabs>
+          <w:tab w:pos="2088" w:val="left"/>
+        </w:tabs>
+        <w:spacing w:after="40"/>
+        <w:ind w:left="2088" w:hanging="2088"/>
+      </w:pPr>
+      <w:r>
+        <w:rPr>
+          <w:b/>
+          <w:sz w:val="22"/>
+        </w:rPr>
+        <w:t>PG</w:t>
+      </w:r>
+      <w:r>
+        <w:rPr>
+          <w:sz w:val="22"/>
+        </w:rPr>
+        <w:tab/>
+        <w:t>Pressure gradient</w:t>
+      </w:r>
+    </w:p>
+    <w:p>
+      <w:pPr>
+        <w:tabs>
+          <w:tab w:pos="2088" w:val="left"/>
+        </w:tabs>
+        <w:spacing w:after="40"/>
+        <w:ind w:left="2088" w:hanging="2088"/>
+      </w:pPr>
+      <w:r>
+        <w:rPr>
+          <w:b/>
+          <w:sz w:val="22"/>
+        </w:rPr>
+        <w:t>PV</w:t>
+      </w:r>
+      <w:r>
+        <w:rPr>
+          <w:sz w:val="22"/>
+        </w:rPr>
+        <w:tab/>
+        <w:t>Pressure–volume</w:t>
+      </w:r>
+    </w:p>
+    <w:p>
+      <w:pPr>
+        <w:tabs>
+          <w:tab w:pos="2088" w:val="left"/>
+        </w:tabs>
+        <w:spacing w:after="40"/>
+        <w:ind w:left="2088" w:hanging="2088"/>
+      </w:pPr>
+      <w:r>
+        <w:rPr>
+          <w:b/>
+          <w:sz w:val="22"/>
+        </w:rPr>
+        <w:t>PVA</w:t>
+      </w:r>
+      <w:r>
+        <w:rPr>
+          <w:sz w:val="22"/>
+        </w:rPr>
+        <w:tab/>
+        <w:t>Pressure–volume area</w:t>
+      </w:r>
+    </w:p>
+    <w:p>
+      <w:pPr>
+        <w:tabs>
+          <w:tab w:pos="2088" w:val="left"/>
+        </w:tabs>
+        <w:spacing w:after="40"/>
+        <w:ind w:left="2088" w:hanging="2088"/>
+      </w:pPr>
+      <w:r>
+        <w:rPr>
+          <w:b/>
+          <w:sz w:val="22"/>
+        </w:rPr>
+        <w:t>SAVR</w:t>
+      </w:r>
+      <w:r>
+        <w:rPr>
+          <w:sz w:val="22"/>
+        </w:rPr>
+        <w:tab/>
+        <w:t>Surgical aortic valve replacement</w:t>
+      </w:r>
+    </w:p>
+    <w:p>
+      <w:pPr>
+        <w:tabs>
+          <w:tab w:pos="2088" w:val="left"/>
+        </w:tabs>
+        <w:spacing w:after="40"/>
+        <w:ind w:left="2088" w:hanging="2088"/>
+      </w:pPr>
+      <w:r>
+        <w:rPr>
+          <w:b/>
+          <w:sz w:val="22"/>
+        </w:rPr>
+        <w:t>SW</w:t>
+      </w:r>
+      <w:r>
+        <w:rPr>
+          <w:sz w:val="22"/>
+        </w:rPr>
+        <w:tab/>
+        <w:t>Stroke work</w:t>
+      </w:r>
+    </w:p>
+    <w:p>
+      <w:pPr>
+        <w:tabs>
+          <w:tab w:pos="2088" w:val="left"/>
+        </w:tabs>
+        <w:spacing w:after="40"/>
+        <w:ind w:left="2088" w:hanging="2088"/>
+      </w:pPr>
+      <w:r>
+        <w:rPr>
+          <w:b/>
+          <w:sz w:val="22"/>
+        </w:rPr>
+        <w:t>TAVI</w:t>
+      </w:r>
+      <w:r>
+        <w:rPr>
+          <w:sz w:val="22"/>
+        </w:rPr>
+        <w:tab/>
+        <w:t>Transcatheter aortic valve implantation</w:t>
+      </w:r>
+    </w:p>
+    <w:p>
+      <w:pPr>
+        <w:tabs>
+          <w:tab w:pos="2088" w:val="left"/>
+        </w:tabs>
+        <w:spacing w:after="40"/>
+        <w:ind w:left="2088" w:hanging="2088"/>
+      </w:pPr>
+      <w:r>
+        <w:rPr>
+          <w:b/>
+          <w:sz w:val="22"/>
+        </w:rPr>
+        <w:t>TKE</w:t>
+      </w:r>
+      <w:r>
+        <w:rPr>
+          <w:sz w:val="22"/>
+        </w:rPr>
+        <w:tab/>
+        <w:t>Turbulent kinetic energy</w:t>
+      </w:r>
+    </w:p>
+    <w:p>
+      <w:pPr>
+        <w:tabs>
+          <w:tab w:pos="2088" w:val="left"/>
+        </w:tabs>
+        <w:spacing w:after="40"/>
+        <w:ind w:left="2088" w:hanging="2088"/>
+      </w:pPr>
+      <w:r>
+        <w:rPr>
+          <w:b/>
+          <w:sz w:val="22"/>
+        </w:rPr>
+        <w:t>TTE</w:t>
+      </w:r>
+      <w:r>
+        <w:rPr>
+          <w:sz w:val="22"/>
+        </w:rPr>
+        <w:tab/>
+        <w:t>Transthoracic echocardiography</w:t>
+      </w:r>
+    </w:p>
+    <w:p>
+      <w:pPr>
+        <w:tabs>
+          <w:tab w:pos="2088" w:val="left"/>
+        </w:tabs>
+        <w:spacing w:after="40"/>
+        <w:ind w:left="2088" w:hanging="2088"/>
+      </w:pPr>
+      <w:r>
+        <w:rPr>
+          <w:b/>
+          <w:sz w:val="22"/>
+        </w:rPr>
+        <w:t>VEL</w:t>
+      </w:r>
+      <w:r>
+        <w:rPr>
+          <w:sz w:val="22"/>
+        </w:rPr>
+        <w:tab/>
+        <w:t>Viscous energy loss</w:t>
+      </w:r>
+    </w:p>
+    <w:p>
+      <w:pPr>
+        <w:tabs>
+          <w:tab w:pos="2088" w:val="left"/>
+        </w:tabs>
+        <w:spacing w:after="40"/>
+        <w:ind w:left="2088" w:hanging="2088"/>
+      </w:pPr>
+      <w:r>
+        <w:rPr>
+          <w:b/>
+          <w:sz w:val="22"/>
+        </w:rPr>
+        <w:t>VENC</w:t>
+      </w:r>
+      <w:r>
+        <w:rPr>
+          <w:sz w:val="22"/>
+        </w:rPr>
+        <w:tab/>
+        <w:t>Velocity encoding</w:t>
+      </w:r>
+    </w:p>
+    <w:p>
+      <w:pPr>
+        <w:tabs>
+          <w:tab w:pos="2088" w:val="left"/>
+        </w:tabs>
+        <w:spacing w:after="40"/>
+        <w:ind w:left="2088" w:hanging="2088"/>
+      </w:pPr>
+      <w:r>
+        <w:rPr>
+          <w:b/>
+          <w:sz w:val="22"/>
+        </w:rPr>
+        <w:t>Vpeak</w:t>
+      </w:r>
+      <w:r>
+        <w:rPr>
+          <w:sz w:val="22"/>
+        </w:rPr>
+        <w:tab/>
+        <w:t>Peak transvalvular velocity</w:t>
+      </w:r>
+    </w:p>
+    <w:p>
+      <w:pPr>
+        <w:tabs>
+          <w:tab w:pos="2088" w:val="left"/>
+        </w:tabs>
+        <w:spacing w:after="40"/>
+        <w:ind w:left="2088" w:hanging="2088"/>
+      </w:pPr>
+      <w:r>
+        <w:rPr>
+          <w:b/>
+          <w:sz w:val="22"/>
+        </w:rPr>
+        <w:t>WSS</w:t>
+      </w:r>
+      <w:r>
+        <w:rPr>
+          <w:sz w:val="22"/>
+        </w:rPr>
+        <w:tab/>
+        <w:t>Wall shear stress</w:t>
+      </w:r>
+    </w:p>
+    <w:p>
+      <w:r>
+        <w:br w:type="page"/>
       </w:r>
     </w:p>
     <w:p>

</xml_diff>

<commit_message>
Add ~300-word abstract with keywords (Title -> Abstract -> Abbreviations -> Chapter 1)
</commit_message>
<xml_diff>
--- a/Final_4D_Flow_CMR_Narrative_Review_FINAL_corrected.docx
+++ b/Final_4D_Flow_CMR_Narrative_Review_FINAL_corrected.docx
@@ -13,6 +13,72 @@
           <w:sz w:val="32"/>
         </w:rPr>
         <w:t>Beyond the Gradient: A Narrative Review of 4D Flow CMR in Aortic Stenosis</w:t>
+      </w:r>
+    </w:p>
+    <w:p>
+      <w:pPr>
+        <w:spacing w:before="200" w:after="120"/>
+      </w:pPr>
+      <w:r>
+        <w:rPr>
+          <w:b/>
+          <w:sz w:val="28"/>
+        </w:rPr>
+        <w:t>Abstract</w:t>
+      </w:r>
+    </w:p>
+    <w:p>
+      <w:pPr>
+        <w:spacing w:after="120" w:line="360" w:lineRule="auto"/>
+        <w:jc w:val="both"/>
+      </w:pPr>
+      <w:r>
+        <w:rPr>
+          <w:sz w:val="22"/>
+        </w:rPr>
+        <w:t>Aortic stenosis (AS) is a common valvular heart disease whose management depends on the accurate assessment of severity. Transthoracic echocardiography (TTE) is the primary imaging modality but has recognised limitations: continuous-wave Doppler is sensitive to the alignment between the ultrasound beam and an eccentric stenotic jet, and the continuity-equation estimate of aortic valve area assumes a circular left ventricular outflow tract. Four-dimensional flow cardiovascular magnetic resonance (4D flow CMR) measures three-directional, time-resolved velocity throughout a volume, allowing measurement planes to be positioned retrospectively, and can quantify advanced haemodynamic measures such as turbulent kinetic energy, viscous energy loss and wall shear stress.</w:t>
+      </w:r>
+    </w:p>
+    <w:p>
+      <w:pPr>
+        <w:spacing w:after="120" w:line="360" w:lineRule="auto"/>
+        <w:jc w:val="both"/>
+      </w:pPr>
+      <w:r>
+        <w:rPr>
+          <w:sz w:val="22"/>
+        </w:rPr>
+        <w:t>This narrative review examines the current evidence for 4D flow CMR in AS, covering its technical basis; the assessment of peak velocity, pressure gradient and valve area against TTE and invasive catheterisation; advanced flow-energy parameters; ventricular and myocardial energetics, including left ventricular blood-flow kinetic energy and non-invasive pressure–volume loop concepts; and emerging associations with functional capacity, ventricular remodelling and valve intervention.</w:t>
+      </w:r>
+    </w:p>
+    <w:p>
+      <w:pPr>
+        <w:spacing w:after="120" w:line="360" w:lineRule="auto"/>
+        <w:jc w:val="both"/>
+      </w:pPr>
+      <w:r>
+        <w:rPr>
+          <w:sz w:val="22"/>
+        </w:rPr>
+        <w:t>Small validation studies show that 4D-flow-derived pressure gradients can agree closely with invasive measurements, and the technique may be particularly useful when Doppler is technically difficult or when severity parameters are discordant. However, the evidence for peak velocity is inconsistent, with some studies reporting higher and others lower values than Doppler, reflecting competing sources of measurement error. Advanced flow-energy measures and ventricular energetic indices remain research tools, and flow energy must not be equated with myocardial mechanical work. Although 4D-flow measurements are associated with symptoms, ventricular remodelling and the decision to intervene, no study has demonstrated that 4D-flow-guided management improves patient-centred outcomes. On current evidence, 4D flow CMR is best regarded as a complementary technique within a multiparametric assessment of AS; larger multicentre studies with standardised acquisition and analysis and prospective, outcome-linked designs are required.</w:t>
+      </w:r>
+    </w:p>
+    <w:p>
+      <w:pPr>
+        <w:spacing w:before="80"/>
+        <w:jc w:val="both"/>
+      </w:pPr>
+      <w:r>
+        <w:rPr>
+          <w:i/>
+          <w:sz w:val="22"/>
+        </w:rPr>
+        <w:t>Keywords: aortic stenosis; 4D flow cardiovascular magnetic resonance; haemodynamic assessment; wall shear stress; pressure–volume loop; myocardial energetics.</w:t>
+      </w:r>
+    </w:p>
+    <w:p>
+      <w:r>
+        <w:br w:type="page"/>
       </w:r>
     </w:p>
     <w:p>

</xml_diff>

<commit_message>
Lock final abstract (hyphenation matched to body; competing sources; external validation)
</commit_message>
<xml_diff>
--- a/Final_4D_Flow_CMR_Narrative_Review_FINAL_corrected.docx
+++ b/Final_4D_Flow_CMR_Narrative_Review_FINAL_corrected.docx
@@ -34,9 +34,10 @@
       </w:pPr>
       <w:r>
         <w:rPr>
+          <w:i w:val="0"/>
           <w:sz w:val="22"/>
         </w:rPr>
-        <w:t>Aortic stenosis (AS) is a common valvular heart disease whose management depends on the accurate assessment of severity. Transthoracic echocardiography (TTE) is the primary imaging modality but has recognised limitations: continuous-wave Doppler is sensitive to the alignment between the ultrasound beam and an eccentric stenotic jet, and the continuity-equation estimate of aortic valve area assumes a circular left ventricular outflow tract. Four-dimensional flow cardiovascular magnetic resonance (4D flow CMR) measures three-directional, time-resolved velocity throughout a volume, allowing measurement planes to be positioned retrospectively, and can quantify advanced haemodynamic measures such as turbulent kinetic energy, viscous energy loss and wall shear stress.</w:t>
+        <w:t>Aortic stenosis (AS) is a common valvular heart disease for which management depends on accurate assessment of disease severity. Transthoracic echocardiography (TTE) is the primary imaging modality but has recognised limitations: continuous-wave Doppler is sensitive to alignment between the ultrasound beam and an eccentric stenotic jet, while the continuity-equation estimate of aortic valve area assumes a circular left ventricular outflow tract. Four-dimensional flow cardiovascular magnetic resonance (4D flow CMR) measures three-directional, time-resolved blood velocity throughout a volume, allowing measurement planes to be positioned retrospectively and enabling quantification of advanced haemodynamic measures such as turbulent kinetic energy, viscous energy loss and wall shear stress.</w:t>
       </w:r>
     </w:p>
     <w:p>
@@ -46,9 +47,10 @@
       </w:pPr>
       <w:r>
         <w:rPr>
+          <w:i w:val="0"/>
           <w:sz w:val="22"/>
         </w:rPr>
-        <w:t>This narrative review examines the current evidence for 4D flow CMR in AS, covering its technical basis; the assessment of peak velocity, pressure gradient and valve area against TTE and invasive catheterisation; advanced flow-energy parameters; ventricular and myocardial energetics, including left ventricular blood-flow kinetic energy and non-invasive pressure–volume loop concepts; and emerging associations with functional capacity, ventricular remodelling and valve intervention.</w:t>
+        <w:t>This narrative review examines the current evidence for 4D flow CMR in AS, covering its technical basis; assessment of peak velocity, pressure gradient and valve area in comparison with TTE and invasive catheterisation; advanced flow-energy parameters; ventricular and myocardial energetics, including left ventricular blood-flow kinetic energy and non-invasive pressure–volume loop concepts; and emerging associations with functional capacity, ventricular remodelling and valve intervention.</w:t>
       </w:r>
     </w:p>
     <w:p>
@@ -58,9 +60,10 @@
       </w:pPr>
       <w:r>
         <w:rPr>
+          <w:i w:val="0"/>
           <w:sz w:val="22"/>
         </w:rPr>
-        <w:t>Small validation studies show that 4D-flow-derived pressure gradients can agree closely with invasive measurements, and the technique may be particularly useful when Doppler is technically difficult or when severity parameters are discordant. However, the evidence for peak velocity is inconsistent, with some studies reporting higher and others lower values than Doppler, reflecting competing sources of measurement error. Advanced flow-energy measures and ventricular energetic indices remain research tools, and flow energy must not be equated with myocardial mechanical work. Although 4D-flow measurements are associated with symptoms, ventricular remodelling and the decision to intervene, no study has demonstrated that 4D-flow-guided management improves patient-centred outcomes. On current evidence, 4D flow CMR is best regarded as a complementary technique within a multiparametric assessment of AS; larger multicentre studies with standardised acquisition and analysis and prospective, outcome-linked designs are required.</w:t>
+        <w:t>Small validation studies show that 4D-flow-derived pressure gradients can agree closely with invasive measurements, and the technique may be particularly useful when Doppler assessment is technically difficult or when conventional severity parameters are discordant. However, evidence for peak velocity is inconsistent, with some studies reporting higher and others lower values than Doppler, reflecting competing sources of measurement error. Advanced flow-energy measures and ventricular energetic indices remain primarily research tools, and flow energy should not be equated with myocardial mechanical work. Although 4D flow measurements have been associated with symptoms, ventricular remodelling and the decision to intervene, no study has demonstrated that 4D-flow-guided management improves patient-centred outcomes. On current evidence, 4D flow CMR is best regarded as a complementary technique within a multiparametric assessment of AS. Larger multicentre studies with standardised acquisition and analysis, external validation and prospective outcome-linked designs are required to establish its clinical utility.</w:t>
       </w:r>
     </w:p>
     <w:p>

</xml_diff>

<commit_message>
Add in-text (Figure 1-10) callouts at the point each figure is discussed
</commit_message>
<xml_diff>
--- a/Final_4D_Flow_CMR_Narrative_Review_FINAL_corrected.docx
+++ b/Final_4D_Flow_CMR_Narrative_Review_FINAL_corrected.docx
@@ -865,7 +865,7 @@
         <w:jc w:val="both"/>
       </w:pPr>
       <w:r>
-        <w:t>However, TTE has important technical limitations. Continuous-wave Doppler measurements depend on alignment between the ultrasound beam and the direction of blood flow. Eccentric stenotic jets can make this alignment difficult, and poor alignment can result in underestimation of Vpeak.</w:t>
+        <w:t>However, TTE has important technical limitations (Figure 1). Continuous-wave Doppler measurements depend on alignment between the ultrasound beam and the direction of blood flow. Eccentric stenotic jets can make this alignment difficult, and poor alignment can result in underestimation of Vpeak.</w:t>
       </w:r>
       <w:r>
         <w:rPr>
@@ -1088,7 +1088,7 @@
         <w:t>4,5</w:t>
       </w:r>
       <w:r>
-        <w:t xml:space="preserve"> This is relevant to AS because the direction of a stenotic jet may be eccentric and difficult to predict before the scan.</w:t>
+        <w:t xml:space="preserve"> This is relevant to AS because the direction of a stenotic jet may be eccentric and difficult to predict before the scan (Figure 3).</w:t>
       </w:r>
     </w:p>
     <w:p>
@@ -1549,7 +1549,7 @@
         <w:jc w:val="both"/>
       </w:pPr>
       <w:r>
-        <w:t>The reconstructed data require several processing steps before quantitative analysis. Background phase errors, including those related to eddy currents, need to be corrected, while concomitant gradient effects may require separate correction.</w:t>
+        <w:t>The reconstructed data require several processing steps before quantitative analysis (Figure 2). Background phase errors, including those related to eddy currents, need to be corrected, while concomitant gradient effects may require separate correction.</w:t>
       </w:r>
       <w:r>
         <w:rPr>
@@ -2513,7 +2513,7 @@
         <w:jc w:val="both"/>
       </w:pPr>
       <w:r>
-        <w:t>Importantly, the direction of the difference is not consistent across all studies. Hälvä et al. compared 4D flow CMR, two-dimensional phase-contrast CMR and TTE in patients with severe AS and found that 4D flow CMR underestimated peak velocity compared with echocardiography, with a bias of −1.1 m/s.</w:t>
+        <w:t>Importantly, the direction of the difference is not consistent across all studies. Hälvä et al. compared 4D flow CMR, two-dimensional phase-contrast CMR and TTE in patients with severe AS and found that 4D flow CMR underestimated peak velocity compared with echocardiography (Figure 4), with a bias of −1.1 m/s.</w:t>
       </w:r>
       <w:r>
         <w:rPr>
@@ -2665,7 +2665,7 @@
         <w:jc w:val="both"/>
       </w:pPr>
       <w:r>
-        <w:t>Archer et al. compared 4D flow CMR, TTE and invasive measurements in 18 patients with severe AS.</w:t>
+        <w:t>Archer et al. compared 4D flow CMR, TTE and invasive measurements (Figure 5) in 18 patients with severe AS.</w:t>
       </w:r>
       <w:r>
         <w:rPr>
@@ -2852,7 +2852,7 @@
         <w:jc w:val="both"/>
       </w:pPr>
       <w:r>
-        <w:t>The difference between Doppler and invasive pressure measurements should not be confused with the effect of Doppler beam alignment on Vpeak. Poor alignment can cause underestimation of Doppler velocity, particularly with eccentric jets. In contrast, differences between Doppler-derived and invasive pressure gradients partly reflect the different pressure measurements obtained by the two techniques and the effect of pressure recovery.</w:t>
+        <w:t>The difference between Doppler and invasive pressure measurements should not be confused with the effect of Doppler beam alignment on Vpeak (Figure 6). Poor alignment can cause underestimation of Doppler velocity, particularly with eccentric jets. In contrast, differences between Doppler-derived and invasive pressure gradients partly reflect the different pressure measurements obtained by the two techniques and the effect of pressure recovery.</w:t>
       </w:r>
       <w:r>
         <w:rPr>
@@ -4090,7 +4090,7 @@
         <w:jc w:val="both"/>
       </w:pPr>
       <w:r>
-        <w:t>PV loops describe the relationship between LV pressure and volume throughout the cardiac cycle. The area enclosed by the loop represents stroke work, while the pressure–volume area (PVA) incorporates stroke work and potential energy. These measures provide information about ventricular mechanical work and efficiency that cannot be obtained from LVEF alone.</w:t>
+        <w:t>PV loops describe the relationship between LV pressure and volume throughout the cardiac cycle (Figure 7). The area enclosed by the loop represents stroke work, while the pressure–volume area (PVA) incorporates stroke work and potential energy. These measures provide information about ventricular mechanical work and efficiency that cannot be obtained from LVEF alone.</w:t>
       </w:r>
       <w:r>
         <w:rPr>
@@ -4369,7 +4369,7 @@
         <w:jc w:val="both"/>
       </w:pPr>
       <w:r>
-        <w:t>The flow-based measures discussed in Chapter 4 and the ventricular measures discussed here describe different parts of the same physiological pathway. TKE and VEL describe energy associated with disturbed flow and energy dissipation within the blood. LV blood-flow kinetic energy describes the movement of blood within the ventricular cavity. PV-loop-derived stroke work and PVA, in contrast, describe mechanical work and energy associated with ventricular contraction.</w:t>
+        <w:t>The flow-based measures discussed in Chapter 4 and the ventricular measures discussed here describe different parts of the same physiological pathway (Figure 8). TKE and VEL describe energy associated with disturbed flow and energy dissipation within the blood. LV blood-flow kinetic energy describes the movement of blood within the ventricular cavity. PV-loop-derived stroke work and PVA, in contrast, describe mechanical work and energy associated with ventricular contraction.</w:t>
       </w:r>
     </w:p>
     <w:p>
@@ -4827,7 +4827,7 @@
         <w:jc w:val="both"/>
       </w:pPr>
       <w:r>
-        <w:t>In Cox regression analysis, 4D flow Vpeak was associated with subsequent valve intervention (hazard ratio 2.51, P &lt; 0.01), whereas CWD Vpeak was not statistically significant in the same analysis (hazard ratio 0.54, P = 0.76).</w:t>
+        <w:t>In Cox regression analysis (Figure 9), 4D flow Vpeak was associated with subsequent valve intervention (hazard ratio 2.51, P &lt; 0.01), whereas CWD Vpeak was not statistically significant in the same analysis (hazard ratio 0.54, P = 0.76).</w:t>
       </w:r>
       <w:r>
         <w:rPr>
@@ -4949,7 +4949,7 @@
         <w:jc w:val="both"/>
       </w:pPr>
       <w:r>
-        <w:t>The distinction between association, prediction and clinical utility is important when interpreting the current evidence. A measurement can agree with a reference method, correlate with functional status, or be associated with a subsequent clinical decision without demonstrating that its use improves patient care.</w:t>
+        <w:t>The distinction between association, prediction and clinical utility is important when interpreting the current evidence (Figure 10). A measurement can agree with a reference method, correlate with functional status, or be associated with a subsequent clinical decision without demonstrating that its use improves patient care.</w:t>
       </w:r>
     </w:p>
     <w:p>

</xml_diff>

<commit_message>
Add Table 1-3 in-text callouts and Chapter 7 cross-references to keystone Figures 6, 8, 10
</commit_message>
<xml_diff>
--- a/Final_4D_Flow_CMR_Narrative_Review_FINAL_corrected.docx
+++ b/Final_4D_Flow_CMR_Narrative_Review_FINAL_corrected.docx
@@ -1151,7 +1151,7 @@
         <w:t>4</w:t>
       </w:r>
       <w:r>
-        <w:t xml:space="preserve"> The consensus statement on 4D flow CMR reports a typical spatial resolution of about 1.5–3.0 mm, a temporal resolution of roughly 30–40 ms and acquisition times of about 5 to 25 minutes.</w:t>
+        <w:t xml:space="preserve"> The consensus statement on 4D flow CMR reports a typical spatial resolution of about 1.5–3.0 mm, a temporal resolution of roughly 30–40 ms and acquisition times of about 5 to 25 minutes (Table 1).</w:t>
       </w:r>
       <w:r>
         <w:rPr>
@@ -1799,7 +1799,7 @@
         <w:jc w:val="both"/>
       </w:pPr>
       <w:r>
-        <w:t>The potential value of 4D flow CMR in AS can be assessed by comparing its measurements of peak velocity, pressure gradient and valve area with established methods. The available evidence shows that 4D flow CMR can measure these parameters, but the differences from TTE are not consistent across studies. This section therefore considers both the potential advantages and the reasons for disagreement between techniques.</w:t>
+        <w:t>The potential value of 4D flow CMR in AS can be assessed by comparing its measurements of peak velocity, pressure gradient and valve area with established methods (Table 2). The available evidence shows that 4D flow CMR can measure these parameters, but the differences from TTE are not consistent across studies. This section therefore considers both the potential advantages and the reasons for disagreement between techniques.</w:t>
       </w:r>
     </w:p>
     <w:p>
@@ -3139,7 +3139,7 @@
         <w:jc w:val="both"/>
       </w:pPr>
       <w:r>
-        <w:t>Beyond the standard measures used to grade AS, 4D flow CMR can provide information about how stenosis alters blood flow and interacts with the aortic wall. Turbulent kinetic energy (TKE) and viscous energy loss (VEL) describe different aspects of haemodynamic energy dissipation, whereas wall shear stress (WSS) describes the mechanical interaction between blood flow and the vessel wall.</w:t>
+        <w:t>Beyond the standard measures used to grade AS, 4D flow CMR can provide information about how stenosis alters blood flow and interacts with the aortic wall. Turbulent kinetic energy (TKE) and viscous energy loss (VEL) describe different aspects of haemodynamic energy dissipation, whereas wall shear stress (WSS) describes the mechanical interaction between blood flow and the vessel wall (Table 3).</w:t>
       </w:r>
       <w:r>
         <w:rPr>
@@ -5196,7 +5196,7 @@
         <w:jc w:val="both"/>
       </w:pPr>
       <w:r>
-        <w:t>The review also identified two separate sources of discrepancy in conventional assessment that should not be conflated. Doppler-derived velocity can be underestimated when the ultrasound beam is not sufficiently aligned with an eccentric stenotic jet.</w:t>
+        <w:t>The review also identified two separate sources of discrepancy in conventional assessment that should not be conflated (Figure 6). Doppler-derived velocity can be underestimated when the ultrasound beam is not sufficiently aligned with an eccentric stenotic jet.</w:t>
       </w:r>
       <w:r>
         <w:rPr>
@@ -5286,7 +5286,7 @@
         <w:jc w:val="both"/>
       </w:pPr>
       <w:r>
-        <w:t>A similar distinction is needed when considering ventricular energetics. The kinetic energy of intracavitary blood flow, TKE and VEL describe properties of blood flow, whereas PV-loop-derived stroke work and pressure-volume area describe mechanical energy generated by the myocardium. These measures are physiologically related but are not interchangeable.</w:t>
+        <w:t>A similar distinction is needed when considering ventricular energetics. The kinetic energy of intracavitary blood flow, TKE and VEL describe properties of blood flow, whereas PV-loop-derived stroke work and pressure-volume area describe mechanical energy generated by the myocardium. These measures are physiologically related but are not interchangeable (Figure 8).</w:t>
       </w:r>
       <w:r>
         <w:rPr>
@@ -5358,7 +5358,7 @@
         <w:jc w:val="both"/>
       </w:pPr>
       <w:r>
-        <w:t>These findings illustrate the difference between measurement validity, prognostic association and clinical utility. A measurement may agree with a reference method, correlate with symptoms or functional capacity, and be associated with a subsequent clinical decision without demonstrating that its use improves patient care. For 4D flow CMR, the evidence is currently strongest for its technical and haemodynamic capabilities. Evidence for functional and prognostic applications is promising but remains based mainly on small observational studies. Much of the AS-specific evidence comes from a small number of cohorts, with several studies originating from the same research programmes and substantial author overlap, while independent studies do not fully agree, particularly on peak velocity.</w:t>
+        <w:t>These findings illustrate the difference between measurement validity, prognostic association and clinical utility (Figure 10). A measurement may agree with a reference method, correlate with symptoms or functional capacity, and be associated with a subsequent clinical decision without demonstrating that its use improves patient care. For 4D flow CMR, the evidence is currently strongest for its technical and haemodynamic capabilities. Evidence for functional and prognostic applications is promising but remains based mainly on small observational studies. Much of the AS-specific evidence comes from a small number of cohorts, with several studies originating from the same research programmes and substantial author overlap, while independent studies do not fully agree, particularly on peak velocity.</w:t>
       </w:r>
       <w:r>
         <w:rPr>

</xml_diff>

<commit_message>
Final formatting: fix Fig9 Vpeak typo; standardise 4D-flow-derived hyphenation; re-render Fig2 vertical for legibility + accurate 'Concept adapted' credit; fix Table 2/3 column widths
</commit_message>
<xml_diff>
--- a/Final_4D_Flow_CMR_Narrative_Review_FINAL_corrected.docx
+++ b/Final_4D_Flow_CMR_Narrative_Review_FINAL_corrected.docx
@@ -1578,8 +1578,8 @@
       <w:r>
         <w:drawing>
           <wp:inline xmlns:a="http://schemas.openxmlformats.org/drawingml/2006/main" xmlns:pic="http://schemas.openxmlformats.org/drawingml/2006/picture">
-            <wp:extent cx="5943600" cy="1419946"/>
-            <wp:docPr id="14" name="Picture 14"/>
+            <wp:extent cx="4206240" cy="6472502"/>
+            <wp:docPr id="29" name="Picture 29"/>
             <wp:cNvGraphicFramePr>
               <a:graphicFrameLocks noChangeAspect="1"/>
             </wp:cNvGraphicFramePr>
@@ -1591,7 +1591,7 @@
                     <pic:cNvPicPr/>
                   </pic:nvPicPr>
                   <pic:blipFill>
-                    <a:blip r:embed="rId22"/>
+                    <a:blip r:embed="rId37"/>
                     <a:stretch>
                       <a:fillRect/>
                     </a:stretch>
@@ -1599,7 +1599,7 @@
                   <pic:spPr>
                     <a:xfrm>
                       <a:off x="0" y="0"/>
-                      <a:ext cx="5943600" cy="1419946"/>
+                      <a:ext cx="4206240" cy="6472502"/>
                     </a:xfrm>
                     <a:prstGeom prst="rect"/>
                   </pic:spPr>
@@ -1628,7 +1628,7 @@
           <w:i w:val="0"/>
           <w:sz w:val="18"/>
         </w:rPr>
-        <w:t>Overview of the 4D flow CMR acquisition and analysis pipeline, adapted for aortic stenosis. Retrospective plane placement (highlighted) allows the peak-velocity plane to be selected after acquisition. Adapted from the 4D flow CMR consensus statement.</w:t>
+        <w:t>Overview of the 4D flow CMR acquisition and analysis pipeline, adapted for aortic stenosis. Retrospective plane placement (highlighted) allows the peak-velocity plane to be selected after acquisition. Concept adapted from the 4D flow CMR consensus statement.</w:t>
       </w:r>
       <w:r>
         <w:rPr>
@@ -1818,7 +1818,7 @@
       <w:tblPr>
         <w:tblStyle w:val="TableGrid"/>
         <w:tblW w:type="auto" w:w="0"/>
-        <w:tblLayout w:type="autofit"/>
+        <w:tblLayout w:type="fixed"/>
         <w:tblLook w:firstColumn="1" w:firstRow="1" w:lastColumn="0" w:lastRow="0" w:noHBand="0" w:noVBand="1" w:val="04A0"/>
       </w:tblPr>
       <w:tblGrid>
@@ -1847,7 +1847,7 @@
         </w:tc>
         <w:tc>
           <w:tcPr>
-            <w:tcW w:type="dxa" w:w="1440"/>
+            <w:tcW w:type="dxa" w:w="1224"/>
           </w:tcPr>
           <w:p>
             <w:r/>
@@ -1862,7 +1862,7 @@
         </w:tc>
         <w:tc>
           <w:tcPr>
-            <w:tcW w:type="dxa" w:w="1440"/>
+            <w:tcW w:type="dxa" w:w="504"/>
           </w:tcPr>
           <w:p>
             <w:r/>
@@ -1877,7 +1877,7 @@
         </w:tc>
         <w:tc>
           <w:tcPr>
-            <w:tcW w:type="dxa" w:w="1440"/>
+            <w:tcW w:type="dxa" w:w="1800"/>
           </w:tcPr>
           <w:p>
             <w:r/>
@@ -1892,7 +1892,7 @@
         </w:tc>
         <w:tc>
           <w:tcPr>
-            <w:tcW w:type="dxa" w:w="1440"/>
+            <w:tcW w:type="dxa" w:w="2520"/>
           </w:tcPr>
           <w:p>
             <w:r/>
@@ -1907,7 +1907,7 @@
         </w:tc>
         <w:tc>
           <w:tcPr>
-            <w:tcW w:type="dxa" w:w="1440"/>
+            <w:tcW w:type="dxa" w:w="1512"/>
           </w:tcPr>
           <w:p>
             <w:r/>
@@ -1947,7 +1947,7 @@
         </w:tc>
         <w:tc>
           <w:tcPr>
-            <w:tcW w:type="dxa" w:w="1440"/>
+            <w:tcW w:type="dxa" w:w="1224"/>
           </w:tcPr>
           <w:p>
             <w:r/>
@@ -1962,7 +1962,7 @@
         </w:tc>
         <w:tc>
           <w:tcPr>
-            <w:tcW w:type="dxa" w:w="1440"/>
+            <w:tcW w:type="dxa" w:w="504"/>
           </w:tcPr>
           <w:p>
             <w:r/>
@@ -1977,7 +1977,7 @@
         </w:tc>
         <w:tc>
           <w:tcPr>
-            <w:tcW w:type="dxa" w:w="1440"/>
+            <w:tcW w:type="dxa" w:w="1800"/>
           </w:tcPr>
           <w:p>
             <w:r/>
@@ -1992,7 +1992,7 @@
         </w:tc>
         <w:tc>
           <w:tcPr>
-            <w:tcW w:type="dxa" w:w="1440"/>
+            <w:tcW w:type="dxa" w:w="2520"/>
           </w:tcPr>
           <w:p>
             <w:r/>
@@ -2007,7 +2007,7 @@
         </w:tc>
         <w:tc>
           <w:tcPr>
-            <w:tcW w:type="dxa" w:w="1440"/>
+            <w:tcW w:type="dxa" w:w="1512"/>
           </w:tcPr>
           <w:p>
             <w:r/>
@@ -2047,7 +2047,7 @@
         </w:tc>
         <w:tc>
           <w:tcPr>
-            <w:tcW w:type="dxa" w:w="1440"/>
+            <w:tcW w:type="dxa" w:w="1224"/>
           </w:tcPr>
           <w:p>
             <w:r/>
@@ -2062,7 +2062,7 @@
         </w:tc>
         <w:tc>
           <w:tcPr>
-            <w:tcW w:type="dxa" w:w="1440"/>
+            <w:tcW w:type="dxa" w:w="504"/>
           </w:tcPr>
           <w:p>
             <w:r/>
@@ -2077,7 +2077,7 @@
         </w:tc>
         <w:tc>
           <w:tcPr>
-            <w:tcW w:type="dxa" w:w="1440"/>
+            <w:tcW w:type="dxa" w:w="1800"/>
           </w:tcPr>
           <w:p>
             <w:r/>
@@ -2092,7 +2092,7 @@
         </w:tc>
         <w:tc>
           <w:tcPr>
-            <w:tcW w:type="dxa" w:w="1440"/>
+            <w:tcW w:type="dxa" w:w="2520"/>
           </w:tcPr>
           <w:p>
             <w:r/>
@@ -2107,7 +2107,7 @@
         </w:tc>
         <w:tc>
           <w:tcPr>
-            <w:tcW w:type="dxa" w:w="1440"/>
+            <w:tcW w:type="dxa" w:w="1512"/>
           </w:tcPr>
           <w:p>
             <w:r/>
@@ -2147,7 +2147,7 @@
         </w:tc>
         <w:tc>
           <w:tcPr>
-            <w:tcW w:type="dxa" w:w="1440"/>
+            <w:tcW w:type="dxa" w:w="1224"/>
           </w:tcPr>
           <w:p>
             <w:r/>
@@ -2162,7 +2162,7 @@
         </w:tc>
         <w:tc>
           <w:tcPr>
-            <w:tcW w:type="dxa" w:w="1440"/>
+            <w:tcW w:type="dxa" w:w="504"/>
           </w:tcPr>
           <w:p>
             <w:r/>
@@ -2177,7 +2177,7 @@
         </w:tc>
         <w:tc>
           <w:tcPr>
-            <w:tcW w:type="dxa" w:w="1440"/>
+            <w:tcW w:type="dxa" w:w="1800"/>
           </w:tcPr>
           <w:p>
             <w:r/>
@@ -2192,7 +2192,7 @@
         </w:tc>
         <w:tc>
           <w:tcPr>
-            <w:tcW w:type="dxa" w:w="1440"/>
+            <w:tcW w:type="dxa" w:w="2520"/>
           </w:tcPr>
           <w:p>
             <w:r/>
@@ -2207,7 +2207,7 @@
         </w:tc>
         <w:tc>
           <w:tcPr>
-            <w:tcW w:type="dxa" w:w="1440"/>
+            <w:tcW w:type="dxa" w:w="1512"/>
           </w:tcPr>
           <w:p>
             <w:r/>
@@ -2247,7 +2247,7 @@
         </w:tc>
         <w:tc>
           <w:tcPr>
-            <w:tcW w:type="dxa" w:w="1440"/>
+            <w:tcW w:type="dxa" w:w="1224"/>
           </w:tcPr>
           <w:p>
             <w:r/>
@@ -2262,7 +2262,7 @@
         </w:tc>
         <w:tc>
           <w:tcPr>
-            <w:tcW w:type="dxa" w:w="1440"/>
+            <w:tcW w:type="dxa" w:w="504"/>
           </w:tcPr>
           <w:p>
             <w:r/>
@@ -2277,7 +2277,7 @@
         </w:tc>
         <w:tc>
           <w:tcPr>
-            <w:tcW w:type="dxa" w:w="1440"/>
+            <w:tcW w:type="dxa" w:w="1800"/>
           </w:tcPr>
           <w:p>
             <w:r/>
@@ -2292,7 +2292,7 @@
         </w:tc>
         <w:tc>
           <w:tcPr>
-            <w:tcW w:type="dxa" w:w="1440"/>
+            <w:tcW w:type="dxa" w:w="2520"/>
           </w:tcPr>
           <w:p>
             <w:r/>
@@ -2307,7 +2307,7 @@
         </w:tc>
         <w:tc>
           <w:tcPr>
-            <w:tcW w:type="dxa" w:w="1440"/>
+            <w:tcW w:type="dxa" w:w="1512"/>
           </w:tcPr>
           <w:p>
             <w:r/>
@@ -2347,7 +2347,7 @@
         </w:tc>
         <w:tc>
           <w:tcPr>
-            <w:tcW w:type="dxa" w:w="1440"/>
+            <w:tcW w:type="dxa" w:w="1224"/>
           </w:tcPr>
           <w:p>
             <w:r/>
@@ -2362,7 +2362,7 @@
         </w:tc>
         <w:tc>
           <w:tcPr>
-            <w:tcW w:type="dxa" w:w="1440"/>
+            <w:tcW w:type="dxa" w:w="504"/>
           </w:tcPr>
           <w:p>
             <w:r/>
@@ -2377,7 +2377,7 @@
         </w:tc>
         <w:tc>
           <w:tcPr>
-            <w:tcW w:type="dxa" w:w="1440"/>
+            <w:tcW w:type="dxa" w:w="1800"/>
           </w:tcPr>
           <w:p>
             <w:r/>
@@ -2392,7 +2392,7 @@
         </w:tc>
         <w:tc>
           <w:tcPr>
-            <w:tcW w:type="dxa" w:w="1440"/>
+            <w:tcW w:type="dxa" w:w="2520"/>
           </w:tcPr>
           <w:p>
             <w:r/>
@@ -2407,7 +2407,7 @@
         </w:tc>
         <w:tc>
           <w:tcPr>
-            <w:tcW w:type="dxa" w:w="1440"/>
+            <w:tcW w:type="dxa" w:w="1512"/>
           </w:tcPr>
           <w:p>
             <w:r/>
@@ -3167,7 +3167,7 @@
       <w:tblPr>
         <w:tblStyle w:val="TableGrid"/>
         <w:tblW w:type="auto" w:w="0"/>
-        <w:tblLayout w:type="autofit"/>
+        <w:tblLayout w:type="fixed"/>
         <w:tblLook w:firstColumn="1" w:firstRow="1" w:lastColumn="0" w:lastRow="0" w:noHBand="0" w:noVBand="1" w:val="04A0"/>
       </w:tblPr>
       <w:tblGrid>
@@ -3181,7 +3181,7 @@
       <w:tr>
         <w:tc>
           <w:tcPr>
-            <w:tcW w:type="dxa" w:w="1440"/>
+            <w:tcW w:type="dxa" w:w="1080"/>
           </w:tcPr>
           <w:p>
             <w:r/>
@@ -3196,7 +3196,7 @@
         </w:tc>
         <w:tc>
           <w:tcPr>
-            <w:tcW w:type="dxa" w:w="1440"/>
+            <w:tcW w:type="dxa" w:w="1656"/>
           </w:tcPr>
           <w:p>
             <w:r/>
@@ -3226,7 +3226,7 @@
         </w:tc>
         <w:tc>
           <w:tcPr>
-            <w:tcW w:type="dxa" w:w="1440"/>
+            <w:tcW w:type="dxa" w:w="2232"/>
           </w:tcPr>
           <w:p>
             <w:r/>
@@ -3241,7 +3241,7 @@
         </w:tc>
         <w:tc>
           <w:tcPr>
-            <w:tcW w:type="dxa" w:w="1440"/>
+            <w:tcW w:type="dxa" w:w="1512"/>
           </w:tcPr>
           <w:p>
             <w:r/>
@@ -3256,7 +3256,7 @@
         </w:tc>
         <w:tc>
           <w:tcPr>
-            <w:tcW w:type="dxa" w:w="1440"/>
+            <w:tcW w:type="dxa" w:w="1152"/>
           </w:tcPr>
           <w:p>
             <w:r/>
@@ -3273,7 +3273,7 @@
       <w:tr>
         <w:tc>
           <w:tcPr>
-            <w:tcW w:type="dxa" w:w="1440"/>
+            <w:tcW w:type="dxa" w:w="1080"/>
           </w:tcPr>
           <w:p>
             <w:r/>
@@ -3288,7 +3288,7 @@
         </w:tc>
         <w:tc>
           <w:tcPr>
-            <w:tcW w:type="dxa" w:w="1440"/>
+            <w:tcW w:type="dxa" w:w="1656"/>
           </w:tcPr>
           <w:p>
             <w:r/>
@@ -3318,7 +3318,7 @@
         </w:tc>
         <w:tc>
           <w:tcPr>
-            <w:tcW w:type="dxa" w:w="1440"/>
+            <w:tcW w:type="dxa" w:w="2232"/>
           </w:tcPr>
           <w:p>
             <w:r/>
@@ -3356,7 +3356,7 @@
         </w:tc>
         <w:tc>
           <w:tcPr>
-            <w:tcW w:type="dxa" w:w="1440"/>
+            <w:tcW w:type="dxa" w:w="1512"/>
           </w:tcPr>
           <w:p>
             <w:r/>
@@ -3379,7 +3379,7 @@
         </w:tc>
         <w:tc>
           <w:tcPr>
-            <w:tcW w:type="dxa" w:w="1440"/>
+            <w:tcW w:type="dxa" w:w="1152"/>
           </w:tcPr>
           <w:p>
             <w:r/>
@@ -3396,7 +3396,7 @@
       <w:tr>
         <w:tc>
           <w:tcPr>
-            <w:tcW w:type="dxa" w:w="1440"/>
+            <w:tcW w:type="dxa" w:w="1080"/>
           </w:tcPr>
           <w:p>
             <w:r/>
@@ -3411,7 +3411,7 @@
         </w:tc>
         <w:tc>
           <w:tcPr>
-            <w:tcW w:type="dxa" w:w="1440"/>
+            <w:tcW w:type="dxa" w:w="1656"/>
           </w:tcPr>
           <w:p>
             <w:r/>
@@ -3441,7 +3441,7 @@
         </w:tc>
         <w:tc>
           <w:tcPr>
-            <w:tcW w:type="dxa" w:w="1440"/>
+            <w:tcW w:type="dxa" w:w="2232"/>
           </w:tcPr>
           <w:p>
             <w:r/>
@@ -3464,7 +3464,7 @@
         </w:tc>
         <w:tc>
           <w:tcPr>
-            <w:tcW w:type="dxa" w:w="1440"/>
+            <w:tcW w:type="dxa" w:w="1512"/>
           </w:tcPr>
           <w:p>
             <w:r/>
@@ -3487,7 +3487,7 @@
         </w:tc>
         <w:tc>
           <w:tcPr>
-            <w:tcW w:type="dxa" w:w="1440"/>
+            <w:tcW w:type="dxa" w:w="1152"/>
           </w:tcPr>
           <w:p>
             <w:r/>
@@ -3504,7 +3504,7 @@
       <w:tr>
         <w:tc>
           <w:tcPr>
-            <w:tcW w:type="dxa" w:w="1440"/>
+            <w:tcW w:type="dxa" w:w="1080"/>
           </w:tcPr>
           <w:p>
             <w:r/>
@@ -3519,7 +3519,7 @@
         </w:tc>
         <w:tc>
           <w:tcPr>
-            <w:tcW w:type="dxa" w:w="1440"/>
+            <w:tcW w:type="dxa" w:w="1656"/>
           </w:tcPr>
           <w:p>
             <w:r/>
@@ -3549,7 +3549,7 @@
         </w:tc>
         <w:tc>
           <w:tcPr>
-            <w:tcW w:type="dxa" w:w="1440"/>
+            <w:tcW w:type="dxa" w:w="2232"/>
           </w:tcPr>
           <w:p>
             <w:r/>
@@ -3572,7 +3572,7 @@
         </w:tc>
         <w:tc>
           <w:tcPr>
-            <w:tcW w:type="dxa" w:w="1440"/>
+            <w:tcW w:type="dxa" w:w="1512"/>
           </w:tcPr>
           <w:p>
             <w:r/>
@@ -3595,7 +3595,7 @@
         </w:tc>
         <w:tc>
           <w:tcPr>
-            <w:tcW w:type="dxa" w:w="1440"/>
+            <w:tcW w:type="dxa" w:w="1152"/>
           </w:tcPr>
           <w:p>
             <w:r/>
@@ -4569,7 +4569,7 @@
         <w:jc w:val="both"/>
       </w:pPr>
       <w:r>
-        <w:t>Several studies have examined whether 4D flow measurements are related to functional limitation in patients with AS. Archer et al. found that 4D flow-derived peak pressure gradient and effective orifice area (EOA) were associated with six-minute walk test (6MWT) distance (r = −0.45, P = 0.01 and r = 0.54, P = 0.002, respectively).</w:t>
+        <w:t>Several studies have examined whether 4D flow measurements are related to functional limitation in patients with AS. Archer et al. found that 4D-flow-derived peak pressure gradient and effective orifice area (EOA) were associated with six-minute walk test (6MWT) distance (r = −0.45, P = 0.01 and r = 0.54, P = 0.002, respectively).</w:t>
       </w:r>
       <w:r>
         <w:rPr>
@@ -4602,7 +4602,7 @@
         <w:jc w:val="both"/>
       </w:pPr>
       <w:r>
-        <w:t>These findings suggest that 4D flow-derived haemodynamic measurements reflect aspects of functional limitation in AS. However, they do not demonstrate that 4D flow is superior to echocardiography for assessing symptoms or exercise capacity. The cohort was small, and the relationships were cross-sectional. The observed correlations therefore indicate an association between haemodynamic measurements and functional status rather than establishing a predictive relationship.</w:t>
+        <w:t>These findings suggest that 4D-flow-derived haemodynamic measurements reflect aspects of functional limitation in AS. However, they do not demonstrate that 4D flow is superior to echocardiography for assessing symptoms or exercise capacity. The cohort was small, and the relationships were cross-sectional. The observed correlations therefore indicate an association between haemodynamic measurements and functional status rather than establishing a predictive relationship.</w:t>
       </w:r>
     </w:p>
     <w:p>
@@ -4651,7 +4651,7 @@
         <w:jc w:val="both"/>
       </w:pPr>
       <w:r>
-        <w:t>A second area of interest is whether 4D flow measurements are associated with the ventricular response following valve intervention. Archer et al. reported that the change in 4D flow-derived pressure gradient after intervention was associated with LV mass regression (r = 0.64, P = 0.04). The corresponding association for the change in Doppler-derived gradient did not reach statistical significance (r = 0.63, P = 0.06).</w:t>
+        <w:t>A second area of interest is whether 4D flow measurements are associated with the ventricular response following valve intervention. Archer et al. reported that the change in 4D-flow-derived pressure gradient after intervention was associated with LV mass regression (r = 0.64, P = 0.04). The corresponding association for the change in Doppler-derived gradient did not reach statistical significance (r = 0.63, P = 0.06).</w:t>
       </w:r>
       <w:r>
         <w:rPr>
@@ -4818,7 +4818,7 @@
           <w:i/>
           <w:sz w:val="16"/>
         </w:rPr>
-        <w:t>AV, aortic valve; CWD, continuous-wave Doppler; HR, hazard ratio; V_peak, peak velocity.</w:t>
+        <w:t>AV, aortic valve; CWD, continuous-wave Doppler; HR, hazard ratio; Vpeak, peak velocity.</w:t>
       </w:r>
     </w:p>
     <w:p>
@@ -5464,7 +5464,7 @@
         <w:jc w:val="both"/>
       </w:pPr>
       <w:r>
-        <w:t>4D flow CMR provides a three-dimensional assessment of blood flow that can address some of the technical limitations of conventional Doppler echocardiography. Its ability to assess flow retrospectively from different planes is particularly relevant to eccentric stenotic jets. Small validation studies support close agreement between 4D flow-derived and invasive pressure-gradient measurements.</w:t>
+        <w:t>4D flow CMR provides a three-dimensional assessment of blood flow that can address some of the technical limitations of conventional Doppler echocardiography. Its ability to assess flow retrospectively from different planes is particularly relevant to eccentric stenotic jets. Small validation studies support close agreement between 4D-flow-derived and invasive pressure-gradient measurements.</w:t>
       </w:r>
       <w:r>
         <w:rPr>

</xml_diff>